<commit_message>
docs: sync contracts, README and conventions with main
</commit_message>
<xml_diff>
--- a/docs/CONVENTIONS.docx
+++ b/docs/CONVENTIONS.docx
@@ -26,33 +26,7 @@
         <w:t xml:space="preserve">Version 1.0.0</w:t>
       </w:r>
     </w:p>
-    <w:sdt>
-      <w:sdtPr>
-        <w:docPartObj>
-          <w:docPartGallery w:val="Table of Contents"/>
-          <w:docPartUnique/>
-        </w:docPartObj>
-      </w:sdtPr>
-      <w:sdtContent>
-        <w:p>
-          <w:pPr>
-            <w:pStyle w:val="TOCHeading"/>
-          </w:pPr>
-          <w:r>
-            <w:t xml:space="preserve">Table of Contents</w:t>
-          </w:r>
-        </w:p>
-        <w:p>
-          <w:r>
-            <w:fldChar w:fldCharType="begin" w:dirty="true"/>
-            <w:instrText xml:space="preserve">TOC \o "1-2" \h \z \u</w:instrText>
-            <w:fldChar w:fldCharType="separate"/>
-            <w:fldChar w:fldCharType="end"/>
-          </w:r>
-        </w:p>
-      </w:sdtContent>
-    </w:sdt>
-    <w:bookmarkStart w:id="20" w:name="purpose-scope"/>
+    <w:bookmarkStart w:id="9" w:name="Xc288a453ded2280e55fb33edb20e553b14b34a5"/>
     <w:p>
       <w:pPr>
         <w:pStyle w:val="Heading1"/>
@@ -82,7 +56,7 @@
         <w:t xml:space="preserve"> </w:t>
       </w:r>
       <w:r>
-        <w:t xml:space="preserve">— file structure, naming, coding practices, Git, and Docker. It exists so three people write code that looks like it came from one, and so anyone can drop into anyone else’s module without relearning the rules.</w:t>
+        <w:t xml:space="preserve">— file structure, naming, coding practices, Git, and Docker. It exists so three people write code that looks like it came from one, and so anyone can drop into anyone else's module without relearning the rules.</w:t>
       </w:r>
     </w:p>
     <w:p>
@@ -107,13 +81,23 @@
           <w:b/>
           <w:bCs/>
         </w:rPr>
-        <w:t xml:space="preserve">docs/praetor-team-plan.md</w:t>
-      </w:r>
-      <w:r>
-        <w:t xml:space="preserve"> </w:t>
-      </w:r>
-      <w:r>
-        <w:t xml:space="preserve">— process, sprints, module ownership, Definition of Done.</w:t>
+        <w:t xml:space="preserve">docs/api-contracts.md</w:t>
+      </w:r>
+      <w:r>
+        <w:t xml:space="preserve"> </w:t>
+      </w:r>
+      <w:r>
+        <w:t xml:space="preserve">— the exact endpoint shapes.</w:t>
+      </w:r>
+      <w:r>
+        <w:t xml:space="preserve"> </w:t>
+      </w:r>
+      <w:r>
+        <w:rPr>
+          <w:b/>
+          <w:bCs/>
+        </w:rPr>
+        <w:t xml:space="preserve">Implement them, don't redesign them.</w:t>
       </w:r>
     </w:p>
     <w:p>
@@ -130,39 +114,6 @@
           <w:b/>
           <w:bCs/>
         </w:rPr>
-        <w:t xml:space="preserve">docs/api-contracts.md</w:t>
-      </w:r>
-      <w:r>
-        <w:t xml:space="preserve"> </w:t>
-      </w:r>
-      <w:r>
-        <w:t xml:space="preserve">— the exact endpoint shapes.</w:t>
-      </w:r>
-      <w:r>
-        <w:t xml:space="preserve"> </w:t>
-      </w:r>
-      <w:r>
-        <w:rPr>
-          <w:b/>
-          <w:bCs/>
-        </w:rPr>
-        <w:t xml:space="preserve">Implement them, don’t redesign them.</w:t>
-      </w:r>
-    </w:p>
-    <w:p>
-      <w:pPr>
-        <w:pStyle w:val="Compact"/>
-        <w:numPr>
-          <w:ilvl w:val="0"/>
-          <w:numId w:val="1001"/>
-        </w:numPr>
-      </w:pPr>
-      <w:r>
-        <w:rPr>
-          <w:rStyle w:val="VerbatimChar"/>
-          <w:b/>
-          <w:bCs/>
-        </w:rPr>
         <w:t xml:space="preserve">db/schema.sql</w:t>
       </w:r>
       <w:r>
@@ -177,7 +128,7 @@
         <w:pStyle w:val="FirstParagraph"/>
       </w:pPr>
       <w:r>
-        <w:t xml:space="preserve">If anything here ever conflicts with those three files,</w:t>
+        <w:t xml:space="preserve">The team plan (process, sprints, module ownership, Definition of Done) is shared with the team separately. If anything here ever conflicts with the API contract or schema,</w:t>
       </w:r>
       <w:r>
         <w:t xml:space="preserve"> </w:t>
@@ -203,8 +154,8 @@
         </w:pict>
       </w:r>
     </w:p>
-    <w:bookmarkEnd w:id="20"/>
-    <w:bookmarkStart w:id="21" w:name="repo-file-structure"/>
+    <w:bookmarkEnd w:id="9"/>
+    <w:bookmarkStart w:id="10" w:name="Xd3fc12516c9c1db87a2c8f81e2b62a9b0d63ab8"/>
     <w:p>
       <w:pPr>
         <w:pStyle w:val="Heading1"/>
@@ -257,7 +208,7 @@
         <w:rPr>
           <w:rStyle w:val="VerbatimChar"/>
         </w:rPr>
-        <w:t xml:space="preserve">├── docs/                   # api-contracts, SRS, team-plan, this file</w:t>
+        <w:t xml:space="preserve">├── docs/                   # api-contracts, this file</w:t>
       </w:r>
       <w:r>
         <w:br/>
@@ -553,8 +504,8 @@
         </w:pict>
       </w:r>
     </w:p>
-    <w:bookmarkEnd w:id="21"/>
-    <w:bookmarkStart w:id="22" w:name="naming-conventions"/>
+    <w:bookmarkEnd w:id="10"/>
+    <w:bookmarkStart w:id="11" w:name="Xdc5d4b6cba5467ad283672aeee1014a0e17ef5f"/>
     <w:p>
       <w:pPr>
         <w:pStyle w:val="Heading1"/>
@@ -566,8 +517,7 @@
     <w:tbl>
       <w:tblPr>
         <w:tblStyle w:val="Table"/>
-        <w:tblW w:type="pct" w:w="5000"/>
-        <w:tblLayout w:type="fixed"/>
+        <w:tblW w:type="auto" w:w="0"/>
         <w:tblLook w:firstRow="1" w:lastRow="0" w:firstColumn="0" w:lastColumn="0" w:noHBand="0" w:noVBand="0" w:val="0020"/>
       </w:tblPr>
       <w:tblGrid>
@@ -1985,8 +1935,8 @@
         </w:pict>
       </w:r>
     </w:p>
-    <w:bookmarkEnd w:id="22"/>
-    <w:bookmarkStart w:id="26" w:name="coding-practices"/>
+    <w:bookmarkEnd w:id="11"/>
+    <w:bookmarkStart w:id="15" w:name="X5080f867d2e8482de31e30ab7dc888f4bf061d9"/>
     <w:p>
       <w:pPr>
         <w:pStyle w:val="Heading1"/>
@@ -1995,7 +1945,7 @@
         <w:t xml:space="preserve">4. Coding practices</w:t>
       </w:r>
     </w:p>
-    <w:bookmarkStart w:id="23" w:name="mvc-what-maps-to-what"/>
+    <w:bookmarkStart w:id="12" w:name="X51610140b5065348585df329c5978e53ae29e87"/>
     <w:p>
       <w:pPr>
         <w:pStyle w:val="Heading2"/>
@@ -2022,25 +1972,7 @@
         <w:t xml:space="preserve">Model-View-Controller</w:t>
       </w:r>
       <w:r>
-        <w:t xml:space="preserve"> </w:t>
-      </w:r>
-      <w:r>
-        <w:t xml:space="preserve">(same mapping as</w:t>
-      </w:r>
-      <w:r>
-        <w:t xml:space="preserve"> </w:t>
-      </w:r>
-      <w:r>
-        <w:rPr>
-          <w:rStyle w:val="VerbatimChar"/>
-        </w:rPr>
-        <w:t xml:space="preserve">praetor-team-plan.md</w:t>
-      </w:r>
-      <w:r>
-        <w:t xml:space="preserve"> </w:t>
-      </w:r>
-      <w:r>
-        <w:t xml:space="preserve">§3):</w:t>
+        <w:t xml:space="preserve">:</w:t>
       </w:r>
     </w:p>
     <w:p>
@@ -2225,11 +2157,11 @@
         <w:t xml:space="preserve">internal layering of the Model/business tier</w:t>
       </w:r>
       <w:r>
-        <w:t xml:space="preserve">, not a departure from MVC — it’s how the Model side stays organized. The View (Angular) talks only to Controllers over the API contract.</w:t>
-      </w:r>
-    </w:p>
-    <w:bookmarkEnd w:id="23"/>
-    <w:bookmarkStart w:id="24" w:name="backend-practices-spring"/>
+        <w:t xml:space="preserve">, not a departure from MVC — it's how the Model side stays organized. The View (Angular) talks only to Controllers over the API contract.</w:t>
+      </w:r>
+    </w:p>
+    <w:bookmarkEnd w:id="12"/>
+    <w:bookmarkStart w:id="13" w:name="Xf6dbc69773d74ed929d60a7931f1fcb1012d6f9"/>
     <w:p>
       <w:pPr>
         <w:pStyle w:val="Heading2"/>
@@ -2701,11 +2633,11 @@
         <w:t xml:space="preserve">{ "error": "...", "status": 400 }</w:t>
       </w:r>
       <w:r>
-        <w:t xml:space="preserve">. Don’t hand-write ad-hoc error JSON per controller.</w:t>
-      </w:r>
-    </w:p>
-    <w:bookmarkEnd w:id="24"/>
-    <w:bookmarkStart w:id="25" w:name="frontend-practices-angular"/>
+        <w:t xml:space="preserve">. Don't hand-write ad-hoc error JSON per controller.</w:t>
+      </w:r>
+    </w:p>
+    <w:bookmarkEnd w:id="13"/>
+    <w:bookmarkStart w:id="14" w:name="X8a18d4c1ba4769a5f5d4796971784954f8a49a6"/>
     <w:p>
       <w:pPr>
         <w:pStyle w:val="Heading2"/>
@@ -2883,15 +2815,267 @@
       </w:r>
     </w:p>
     <w:p>
+      <w:pPr>
+        <w:pStyle w:val="Compact"/>
+        <w:numPr>
+          <w:ilvl w:val="0"/>
+          <w:numId w:val="1005"/>
+        </w:numPr>
+      </w:pPr>
+      <w:r>
+        <w:rPr>
+          <w:b/>
+          <w:bCs/>
+        </w:rPr>
+        <w:t xml:space="preserve">Every component is</w:t>
+      </w:r>
+      <w:r>
+        <w:rPr>
+          <w:b/>
+          <w:bCs/>
+        </w:rPr>
+        <w:t xml:space="preserve"> </w:t>
+      </w:r>
+      <w:r>
+        <w:rPr>
+          <w:rStyle w:val="VerbatimChar"/>
+          <w:b/>
+          <w:bCs/>
+        </w:rPr>
+        <w:t xml:space="preserve">ChangeDetectionStrategy.OnPush</w:t>
+      </w:r>
+      <w:r>
+        <w:rPr>
+          <w:b/>
+          <w:bCs/>
+        </w:rPr>
+        <w:t xml:space="preserve">, so every</w:t>
+      </w:r>
+      <w:r>
+        <w:rPr>
+          <w:b/>
+          <w:bCs/>
+        </w:rPr>
+        <w:t xml:space="preserve"> </w:t>
+      </w:r>
+      <w:r>
+        <w:rPr>
+          <w:rStyle w:val="VerbatimChar"/>
+          <w:b/>
+          <w:bCs/>
+        </w:rPr>
+        <w:t xml:space="preserve">subscribe</w:t>
+      </w:r>
+      <w:r>
+        <w:rPr>
+          <w:b/>
+          <w:bCs/>
+        </w:rPr>
+        <w:t xml:space="preserve"> </w:t>
+      </w:r>
+      <w:r>
+        <w:rPr>
+          <w:b/>
+          <w:bCs/>
+        </w:rPr>
+        <w:t xml:space="preserve">pipes</w:t>
+      </w:r>
+      <w:r>
+        <w:rPr>
+          <w:b/>
+          <w:bCs/>
+        </w:rPr>
+        <w:t xml:space="preserve"> </w:t>
+      </w:r>
+      <w:r>
+        <w:rPr>
+          <w:rStyle w:val="VerbatimChar"/>
+          <w:b/>
+          <w:bCs/>
+        </w:rPr>
+        <w:t xml:space="preserve">markDirty(this.cdr)</w:t>
+      </w:r>
+      <w:r>
+        <w:rPr>
+          <w:b/>
+          <w:bCs/>
+        </w:rPr>
+        <w:t xml:space="preserve">.</w:t>
+      </w:r>
+      <w:r>
+        <w:t xml:space="preserve"> </w:t>
+      </w:r>
+      <w:r>
+        <w:t xml:space="preserve">Assigning a field inside a</w:t>
+      </w:r>
+      <w:r>
+        <w:t xml:space="preserve"> </w:t>
+      </w:r>
+      <w:r>
+        <w:rPr>
+          <w:rStyle w:val="VerbatimChar"/>
+        </w:rPr>
+        <w:t xml:space="preserve">subscribe</w:t>
+      </w:r>
+      <w:r>
+        <w:t xml:space="preserve"> </w:t>
+      </w:r>
+      <w:r>
+        <w:t xml:space="preserve">callback is</w:t>
+      </w:r>
+      <w:r>
+        <w:t xml:space="preserve"> </w:t>
+      </w:r>
+      <w:r>
+        <w:rPr>
+          <w:i/>
+          <w:iCs/>
+        </w:rPr>
+        <w:t xml:space="preserve">not</w:t>
+      </w:r>
+      <w:r>
+        <w:t xml:space="preserve"> </w:t>
+      </w:r>
+      <w:r>
+        <w:t xml:space="preserve">one of the things that marks an OnPush</w:t>
+      </w:r>
+      <w:r>
+        <w:t xml:space="preserve"> </w:t>
+      </w:r>
+      <w:r>
+        <w:t xml:space="preserve">component dirty, so a screen can silently stop updating while still compiling and still passing</w:t>
+      </w:r>
+      <w:r>
+        <w:t xml:space="preserve"> </w:t>
+      </w:r>
+      <w:r>
+        <w:t xml:space="preserve">every unit test. The one operator lives in</w:t>
+      </w:r>
+      <w:r>
+        <w:t xml:space="preserve"> </w:t>
+      </w:r>
+      <w:r>
+        <w:rPr>
+          <w:rStyle w:val="VerbatimChar"/>
+        </w:rPr>
+        <w:t xml:space="preserve">core/rx/mark-dirty.ts</w:t>
+      </w:r>
+      <w:r>
+        <w:t xml:space="preserve"> </w:t>
+      </w:r>
+      <w:r>
+        <w:t xml:space="preserve">and is written that way so a</w:t>
+      </w:r>
+      <w:r>
+        <w:t xml:space="preserve"> </w:t>
+      </w:r>
+      <w:r>
+        <w:t xml:space="preserve">missing one can be found mechanically:</w:t>
+      </w:r>
+      <w:r>
+        <w:t xml:space="preserve"> </w:t>
+      </w:r>
+      <w:r>
+        <w:rPr>
+          <w:rStyle w:val="VerbatimChar"/>
+          <w:b/>
+          <w:bCs/>
+        </w:rPr>
+        <w:t xml:space="preserve">node scripts/check-mark-dirty.mjs</w:t>
+      </w:r>
+      <w:r>
+        <w:t xml:space="preserve"> </w:t>
+      </w:r>
+      <w:r>
+        <w:t xml:space="preserve">names</w:t>
+      </w:r>
+      <w:r>
+        <w:t xml:space="preserve"> </w:t>
+      </w:r>
+      <w:r>
+        <w:rPr>
+          <w:rStyle w:val="VerbatimChar"/>
+        </w:rPr>
+        <w:t xml:space="preserve">file:line</w:t>
+      </w:r>
+      <w:r>
+        <w:t xml:space="preserve"> </w:t>
+      </w:r>
+      <w:r>
+        <w:t xml:space="preserve">for any offender and exits non-zero. Three components legitimately call</w:t>
+      </w:r>
+      <w:r>
+        <w:t xml:space="preserve"> </w:t>
+      </w:r>
+      <w:r>
+        <w:rPr>
+          <w:rStyle w:val="VerbatimChar"/>
+        </w:rPr>
+        <w:t xml:space="preserve">markForCheck()</w:t>
+      </w:r>
+      <w:r>
+        <w:t xml:space="preserve"> </w:t>
+      </w:r>
+      <w:r>
+        <w:t xml:space="preserve">directly</w:t>
+      </w:r>
+      <w:r>
+        <w:t xml:space="preserve"> </w:t>
+      </w:r>
+      <w:r>
+        <w:t xml:space="preserve">because their state moves outside any stream (countdown's</w:t>
+      </w:r>
+      <w:r>
+        <w:t xml:space="preserve"> </w:t>
+      </w:r>
+      <w:r>
+        <w:rPr>
+          <w:rStyle w:val="VerbatimChar"/>
+        </w:rPr>
+        <w:t xml:space="preserve">setInterval</w:t>
+      </w:r>
+      <w:r>
+        <w:t xml:space="preserve">, rich-text's lazy KaTeX</w:t>
+      </w:r>
+      <w:r>
+        <w:t xml:space="preserve"> </w:t>
+      </w:r>
+      <w:r>
+        <w:t xml:space="preserve">import, problem-detail's cooldown timer + Monaco load); the script lists those rather than failing</w:t>
+      </w:r>
+      <w:r>
+        <w:t xml:space="preserve"> </w:t>
+      </w:r>
+      <w:r>
+        <w:t xml:space="preserve">them.</w:t>
+      </w:r>
+      <w:r>
+        <w:t xml:space="preserve"> </w:t>
+      </w:r>
+      <w:r>
+        <w:rPr>
+          <w:b/>
+          <w:bCs/>
+        </w:rPr>
+        <w:t xml:space="preserve">Run it before opening a frontend PR</w:t>
+      </w:r>
+      <w:r>
+        <w:t xml:space="preserve"> </w:t>
+      </w:r>
+      <w:r>
+        <w:t xml:space="preserve">— it is not in CI yet.</w:t>
+      </w:r>
+    </w:p>
+    <w:p>
       <w:r>
         <w:pict>
           <v:rect style="width:0;height:1.5pt" o:hralign="center" o:hrstd="t" o:hr="t"/>
         </w:pict>
       </w:r>
     </w:p>
-    <w:bookmarkEnd w:id="25"/>
-    <w:bookmarkEnd w:id="26"/>
-    <w:bookmarkStart w:id="27" w:name="api-contract-discipline"/>
+    <w:bookmarkEnd w:id="14"/>
+    <w:bookmarkEnd w:id="15"/>
+    <w:bookmarkStart w:id="16" w:name="X99a790f35b4a78b950e4bf603d1507f586af7e7"/>
     <w:p>
       <w:pPr>
         <w:pStyle w:val="Heading1"/>
@@ -2940,7 +3124,7 @@
         <w:t xml:space="preserve"> </w:t>
       </w:r>
       <w:r>
-        <w:t xml:space="preserve">Implement them exactly; if a shape genuinely must change, change the contract doc first and tell the team — don’t diverge silently.</w:t>
+        <w:t xml:space="preserve">Implement them exactly; if a shape genuinely must change, change the contract doc first and tell the team — don't diverge silently.</w:t>
       </w:r>
     </w:p>
     <w:p>
@@ -3181,7 +3365,7 @@
         <w:t xml:space="preserve"> </w:t>
       </w:r>
       <w:r>
-        <w:t xml:space="preserve">call another module’s controller. Broken CRUD → seed SQL still fills the tables → judging + demo survive.</w:t>
+        <w:t xml:space="preserve">call another module's controller. Broken CRUD → seed SQL still fills the tables → judging + demo survive.</w:t>
       </w:r>
     </w:p>
     <w:p>
@@ -3209,7 +3393,10 @@
         <w:t xml:space="preserve"> </w:t>
       </w:r>
       <w:r>
-        <w:t xml:space="preserve">(e.g. </w:t>
+        <w:t xml:space="preserve">(e.g.</w:t>
+      </w:r>
+      <w:r>
+        <w:t xml:space="preserve"> </w:t>
       </w:r>
       <w:r>
         <w:rPr>
@@ -3302,8 +3489,8 @@
         </w:pict>
       </w:r>
     </w:p>
-    <w:bookmarkEnd w:id="27"/>
-    <w:bookmarkStart w:id="28" w:name="git-workflow"/>
+    <w:bookmarkEnd w:id="16"/>
+    <w:bookmarkStart w:id="17" w:name="X3a4a5d14121582b3d89b09b778867ba1de4dfb6"/>
     <w:p>
       <w:pPr>
         <w:pStyle w:val="Heading1"/>
@@ -3436,7 +3623,66 @@
         <w:t xml:space="preserve"> </w:t>
       </w:r>
       <w:r>
-        <w:t xml:space="preserve">stays green and demoable at all times.</w:t>
+        <w:t xml:space="preserve">stays green and demoable at all times — and since</w:t>
+      </w:r>
+      <w:r>
+        <w:t xml:space="preserve"> </w:t>
+      </w:r>
+      <w:r>
+        <w:rPr>
+          <w:rStyle w:val="VerbatimChar"/>
+        </w:rPr>
+        <w:t xml:space="preserve">#48</w:t>
+      </w:r>
+      <w:r>
+        <w:t xml:space="preserve"> </w:t>
+      </w:r>
+      <w:r>
+        <w:t xml:space="preserve">that is</w:t>
+      </w:r>
+      <w:r>
+        <w:t xml:space="preserve"> </w:t>
+      </w:r>
+      <w:r>
+        <w:rPr>
+          <w:b/>
+          <w:bCs/>
+        </w:rPr>
+        <w:t xml:space="preserve">machine-checked</w:t>
+      </w:r>
+      <w:r>
+        <w:t xml:space="preserve">:</w:t>
+      </w:r>
+      <w:r>
+        <w:t xml:space="preserve"> </w:t>
+      </w:r>
+      <w:r>
+        <w:rPr>
+          <w:rStyle w:val="VerbatimChar"/>
+        </w:rPr>
+        <w:t xml:space="preserve">.github/workflows/ci.yml</w:t>
+      </w:r>
+      <w:r>
+        <w:t xml:space="preserve"> </w:t>
+      </w:r>
+      <w:r>
+        <w:t xml:space="preserve">runs backend unit tests, the shipped</w:t>
+      </w:r>
+      <w:r>
+        <w:t xml:space="preserve"> </w:t>
+      </w:r>
+      <w:r>
+        <w:t xml:space="preserve">frontend build, and the e2e journey on every push and PR.</w:t>
+      </w:r>
+      <w:r>
+        <w:t xml:space="preserve"> </w:t>
+      </w:r>
+      <w:r>
+        <w:rPr>
+          <w:b/>
+          <w:bCs/>
+        </w:rPr>
+        <w:t xml:space="preserve">A red PR does not merge.</w:t>
       </w:r>
     </w:p>
     <w:p>
@@ -3508,19 +3754,7 @@
         <w:t xml:space="preserve"> </w:t>
       </w:r>
       <w:r>
-        <w:t xml:space="preserve">Subject ≤ 50 chars, imperative mood. Body only when the</w:t>
-      </w:r>
-      <w:r>
-        <w:t xml:space="preserve"> </w:t>
-      </w:r>
-      <w:r>
-        <w:t xml:space="preserve">“why”</w:t>
-      </w:r>
-      <w:r>
-        <w:t xml:space="preserve"> </w:t>
-      </w:r>
-      <w:r>
-        <w:t xml:space="preserve">isn’t obvious.</w:t>
+        <w:t xml:space="preserve">Subject ≤ 50 chars, imperative mood. Body only when the "why" isn't obvious.</w:t>
       </w:r>
     </w:p>
     <w:p>
@@ -3674,6 +3908,15 @@
         <w:rPr>
           <w:rStyle w:val="VerbatimChar"/>
         </w:rPr>
+        <w:t xml:space="preserve">- [ ] CI green (all three jobs)</w:t>
+      </w:r>
+      <w:r>
+        <w:br/>
+      </w:r>
+      <w:r>
+        <w:rPr>
+          <w:rStyle w:val="VerbatimChar"/>
+        </w:rPr>
         <w:t xml:space="preserve">- [ ] Manually verified in the running app</w:t>
       </w:r>
       <w:r>
@@ -3702,8 +3945,8 @@
         </w:pict>
       </w:r>
     </w:p>
-    <w:bookmarkEnd w:id="28"/>
-    <w:bookmarkStart w:id="29" w:name="docker-local-dev"/>
+    <w:bookmarkEnd w:id="17"/>
+    <w:bookmarkStart w:id="18" w:name="X948b14f5d635917c9d0c9d4007cb09919744697"/>
     <w:p>
       <w:pPr>
         <w:pStyle w:val="Heading1"/>
@@ -3800,7 +4043,7 @@
         <w:t xml:space="preserve">docker compose up</w:t>
       </w:r>
       <w:r>
-        <w:t xml:space="preserve">, it’s not done.</w:t>
+        <w:t xml:space="preserve">, it's not done.</w:t>
       </w:r>
     </w:p>
     <w:p>
@@ -3882,13 +4125,98 @@
           <w:b/>
           <w:bCs/>
         </w:rPr>
-        <w:t xml:space="preserve">Destroy the container after each run</w:t>
-      </w:r>
-      <w:r>
-        <w:t xml:space="preserve"> </w:t>
-      </w:r>
-      <w:r>
-        <w:t xml:space="preserve">— no reuse, no state leaking between submissions.</w:t>
+        <w:t xml:space="preserve">Destroy the container after each submission</w:t>
+      </w:r>
+      <w:r>
+        <w:t xml:space="preserve"> </w:t>
+      </w:r>
+      <w:r>
+        <w:t xml:space="preserve">— no state leaks between submissions. Note the</w:t>
+      </w:r>
+      <w:r>
+        <w:t xml:space="preserve"> </w:t>
+      </w:r>
+      <w:r>
+        <w:t xml:space="preserve">unit: since</w:t>
+      </w:r>
+      <w:r>
+        <w:t xml:space="preserve"> </w:t>
+      </w:r>
+      <w:r>
+        <w:rPr>
+          <w:rStyle w:val="VerbatimChar"/>
+        </w:rPr>
+        <w:t xml:space="preserve">#51</w:t>
+      </w:r>
+      <w:r>
+        <w:t xml:space="preserve"> </w:t>
+      </w:r>
+      <w:r>
+        <w:t xml:space="preserve">the judge stands up</w:t>
+      </w:r>
+      <w:r>
+        <w:t xml:space="preserve"> </w:t>
+      </w:r>
+      <w:r>
+        <w:rPr>
+          <w:b/>
+          <w:bCs/>
+        </w:rPr>
+        <w:t xml:space="preserve">one container per submission</w:t>
+      </w:r>
+      <w:r>
+        <w:t xml:space="preserve"> </w:t>
+      </w:r>
+      <w:r>
+        <w:t xml:space="preserve">and runs each test case as</w:t>
+      </w:r>
+      <w:r>
+        <w:t xml:space="preserve"> </w:t>
+      </w:r>
+      <w:r>
+        <w:t xml:space="preserve">a</w:t>
+      </w:r>
+      <w:r>
+        <w:t xml:space="preserve"> </w:t>
+      </w:r>
+      <w:r>
+        <w:rPr>
+          <w:rStyle w:val="VerbatimChar"/>
+        </w:rPr>
+        <w:t xml:space="preserve">docker exec</w:t>
+      </w:r>
+      <w:r>
+        <w:t xml:space="preserve"> </w:t>
+      </w:r>
+      <w:r>
+        <w:t xml:space="preserve">into it, rather than one container per case; that is where its ~4× speedup comes</w:t>
+      </w:r>
+      <w:r>
+        <w:t xml:space="preserve"> </w:t>
+      </w:r>
+      <w:r>
+        <w:t xml:space="preserve">from. Cases within a single submission therefore share a container, which is a submission's own</w:t>
+      </w:r>
+      <w:r>
+        <w:t xml:space="preserve"> </w:t>
+      </w:r>
+      <w:r>
+        <w:t xml:space="preserve">code either way. Set</w:t>
+      </w:r>
+      <w:r>
+        <w:t xml:space="preserve"> </w:t>
+      </w:r>
+      <w:r>
+        <w:rPr>
+          <w:rStyle w:val="VerbatimChar"/>
+        </w:rPr>
+        <w:t xml:space="preserve">SANDBOX_REUSE_CONTAINER=false</w:t>
+      </w:r>
+      <w:r>
+        <w:t xml:space="preserve"> </w:t>
+      </w:r>
+      <w:r>
+        <w:t xml:space="preserve">to fall back to one container per case.</w:t>
       </w:r>
     </w:p>
     <w:p>
@@ -4014,8 +4342,8 @@
         </w:pict>
       </w:r>
     </w:p>
-    <w:bookmarkEnd w:id="29"/>
-    <w:bookmarkStart w:id="30" w:name="testing-definition-of-done"/>
+    <w:bookmarkEnd w:id="18"/>
+    <w:bookmarkStart w:id="19" w:name="Xc6085f7020b21f4e98b76146c5f42c16d528a0c"/>
     <w:p>
       <w:pPr>
         <w:pStyle w:val="Heading1"/>
@@ -4107,7 +4435,164 @@
         <w:t xml:space="preserve"> </w:t>
       </w:r>
       <w:r>
-        <w:t xml:space="preserve">solutions per seeded problem; run them every sprint as a smoke test so a refactor can’t silently break verdicts.</w:t>
+        <w:t xml:space="preserve">solutions per seeded</w:t>
+      </w:r>
+      <w:r>
+        <w:t xml:space="preserve"> </w:t>
+      </w:r>
+      <w:r>
+        <w:t xml:space="preserve">problem; run them every sprint as a smoke test so a refactor can't silently break verdicts.</w:t>
+      </w:r>
+      <w:r>
+        <w:t xml:space="preserve"> </w:t>
+      </w:r>
+      <w:r>
+        <w:rPr>
+          <w:b/>
+          <w:bCs/>
+        </w:rPr>
+        <w:t xml:space="preserve">The AC half of this exists</w:t>
+      </w:r>
+      <w:r>
+        <w:t xml:space="preserve">:</w:t>
+      </w:r>
+      <w:r>
+        <w:t xml:space="preserve"> </w:t>
+      </w:r>
+      <w:r>
+        <w:rPr>
+          <w:rStyle w:val="VerbatimChar"/>
+        </w:rPr>
+        <w:t xml:space="preserve">demo/solutions/&lt;problem-slug&gt;/{main.cpp,main.py,Main.java}</w:t>
+      </w:r>
+      <w:r>
+        <w:t xml:space="preserve"> </w:t>
+      </w:r>
+      <w:r>
+        <w:t xml:space="preserve">— one</w:t>
+      </w:r>
+      <w:r>
+        <w:t xml:space="preserve"> </w:t>
+      </w:r>
+      <w:r>
+        <w:t xml:space="preserve">accepted solution for every seeded problem in every language the judge offers — and</w:t>
+      </w:r>
+      <w:r>
+        <w:t xml:space="preserve"> </w:t>
+      </w:r>
+      <w:r>
+        <w:rPr>
+          <w:rStyle w:val="VerbatimChar"/>
+        </w:rPr>
+        <w:t xml:space="preserve">node demo/solutions/verify.mjs</w:t>
+      </w:r>
+      <w:r>
+        <w:t xml:space="preserve"> </w:t>
+      </w:r>
+      <w:r>
+        <w:t xml:space="preserve">submits all of them and asserts</w:t>
+      </w:r>
+      <w:r>
+        <w:t xml:space="preserve"> </w:t>
+      </w:r>
+      <w:r>
+        <w:rPr>
+          <w:rStyle w:val="VerbatimChar"/>
+        </w:rPr>
+        <w:t xml:space="preserve">AC</w:t>
+      </w:r>
+      <w:r>
+        <w:t xml:space="preserve">. The</w:t>
+      </w:r>
+      <w:r>
+        <w:t xml:space="preserve"> </w:t>
+      </w:r>
+      <w:r>
+        <w:rPr>
+          <w:b/>
+          <w:bCs/>
+        </w:rPr>
+        <w:t xml:space="preserve">WA/TLE/MLE/RE/CE</w:t>
+      </w:r>
+      <w:r>
+        <w:rPr>
+          <w:b/>
+          <w:bCs/>
+        </w:rPr>
+        <w:t xml:space="preserve"> </w:t>
+      </w:r>
+      <w:r>
+        <w:rPr>
+          <w:b/>
+          <w:bCs/>
+        </w:rPr>
+        <w:t xml:space="preserve">half does not exist yet</w:t>
+      </w:r>
+      <w:r>
+        <w:t xml:space="preserve">; those verdicts are still produced by typing wrong code by hand. The</w:t>
+      </w:r>
+      <w:r>
+        <w:t xml:space="preserve"> </w:t>
+      </w:r>
+      <w:r>
+        <w:t xml:space="preserve">filenames are fixed by</w:t>
+      </w:r>
+      <w:r>
+        <w:t xml:space="preserve"> </w:t>
+      </w:r>
+      <w:r>
+        <w:rPr>
+          <w:rStyle w:val="VerbatimChar"/>
+        </w:rPr>
+        <w:t xml:space="preserve">submission/engine/Language.java</w:t>
+      </w:r>
+      <w:r>
+        <w:t xml:space="preserve"> </w:t>
+      </w:r>
+      <w:r>
+        <w:t xml:space="preserve">(</w:t>
+      </w:r>
+      <w:r>
+        <w:rPr>
+          <w:rStyle w:val="VerbatimChar"/>
+        </w:rPr>
+        <w:t xml:space="preserve">Main.java</w:t>
+      </w:r>
+      <w:r>
+        <w:t xml:space="preserve"> </w:t>
+      </w:r>
+      <w:r>
+        <w:t xml:space="preserve">must hold</w:t>
+      </w:r>
+      <w:r>
+        <w:t xml:space="preserve"> </w:t>
+      </w:r>
+      <w:r>
+        <w:rPr>
+          <w:rStyle w:val="VerbatimChar"/>
+        </w:rPr>
+        <w:t xml:space="preserve">public class Main</w:t>
+      </w:r>
+      <w:r>
+        <w:t xml:space="preserve"> </w:t>
+      </w:r>
+      <w:r>
+        <w:t xml:space="preserve">or</w:t>
+      </w:r>
+      <w:r>
+        <w:t xml:space="preserve"> </w:t>
+      </w:r>
+      <w:r>
+        <w:rPr>
+          <w:rStyle w:val="VerbatimChar"/>
+        </w:rPr>
+        <w:t xml:space="preserve">javac</w:t>
+      </w:r>
+      <w:r>
+        <w:t xml:space="preserve"> </w:t>
+      </w:r>
+      <w:r>
+        <w:t xml:space="preserve">gives an honest CE) — don't rename them.</w:t>
       </w:r>
     </w:p>
     <w:p>
@@ -4123,13 +4608,85 @@
           <w:b/>
           <w:bCs/>
         </w:rPr>
-        <w:t xml:space="preserve">Frontend:</w:t>
-      </w:r>
-      <w:r>
-        <w:t xml:space="preserve"> </w:t>
-      </w:r>
-      <w:r>
-        <w:t xml:space="preserve">component tests for the submit + standings flows.</w:t>
+        <w:t xml:space="preserve">Frontend: there is no test runner in v1 — state it plainly rather than pretend.</w:t>
+      </w:r>
+      <w:r>
+        <w:t xml:space="preserve"> </w:t>
+      </w:r>
+      <w:r>
+        <w:t xml:space="preserve">No</w:t>
+      </w:r>
+      <w:r>
+        <w:t xml:space="preserve"> </w:t>
+      </w:r>
+      <w:r>
+        <w:rPr>
+          <w:rStyle w:val="VerbatimChar"/>
+        </w:rPr>
+        <w:t xml:space="preserve">.spec.ts</w:t>
+      </w:r>
+      <w:r>
+        <w:t xml:space="preserve">, no karma/jest/vitest, no</w:t>
+      </w:r>
+      <w:r>
+        <w:t xml:space="preserve"> </w:t>
+      </w:r>
+      <w:r>
+        <w:rPr>
+          <w:rStyle w:val="VerbatimChar"/>
+        </w:rPr>
+        <w:t xml:space="preserve">npm test</w:t>
+      </w:r>
+      <w:r>
+        <w:t xml:space="preserve">. What stands in for it: the</w:t>
+      </w:r>
+      <w:r>
+        <w:t xml:space="preserve"> </w:t>
+      </w:r>
+      <w:r>
+        <w:rPr>
+          <w:b/>
+          <w:bCs/>
+        </w:rPr>
+        <w:t xml:space="preserve">e2e journey</w:t>
+      </w:r>
+      <w:r>
+        <w:t xml:space="preserve"> </w:t>
+      </w:r>
+      <w:r>
+        <w:t xml:space="preserve">(</w:t>
+      </w:r>
+      <w:r>
+        <w:rPr>
+          <w:rStyle w:val="VerbatimChar"/>
+        </w:rPr>
+        <w:t xml:space="preserve">scripts/e2e.mjs</w:t>
+      </w:r>
+      <w:r>
+        <w:t xml:space="preserve">, run in CI) exercises submit and standings against the real stack, and</w:t>
+      </w:r>
+      <w:r>
+        <w:t xml:space="preserve"> </w:t>
+      </w:r>
+      <w:r>
+        <w:rPr>
+          <w:rStyle w:val="VerbatimChar"/>
+          <w:b/>
+          <w:bCs/>
+        </w:rPr>
+        <w:t xml:space="preserve">scripts/check-mark-dirty.mjs</w:t>
+      </w:r>
+      <w:r>
+        <w:t xml:space="preserve"> </w:t>
+      </w:r>
+      <w:r>
+        <w:t xml:space="preserve">guards the one convention a compiler cannot (§4.3). Adding a</w:t>
+      </w:r>
+      <w:r>
+        <w:t xml:space="preserve"> </w:t>
+      </w:r>
+      <w:r>
+        <w:t xml:space="preserve">runner is a v2 item; until then do not write a DoD checkbox that no one can tick.</w:t>
       </w:r>
     </w:p>
     <w:p>
@@ -4232,7 +4789,17 @@
         </w:numPr>
       </w:pPr>
       <w:r>
-        <w:t xml:space="preserve">Endpoint matches the API contract.</w:t>
+        <w:rPr>
+          <w:b/>
+          <w:bCs/>
+        </w:rPr>
+        <w:t xml:space="preserve">CI green on all three jobs</w:t>
+      </w:r>
+      <w:r>
+        <w:t xml:space="preserve"> </w:t>
+      </w:r>
+      <w:r>
+        <w:t xml:space="preserve">— unit tests, frontend build, e2e journey.</w:t>
       </w:r>
     </w:p>
     <w:p>
@@ -4244,7 +4811,7 @@
         </w:numPr>
       </w:pPr>
       <w:r>
-        <w:t xml:space="preserve">Manually verified in the running app.</w:t>
+        <w:t xml:space="preserve">Endpoint matches the API contract.</w:t>
       </w:r>
     </w:p>
     <w:p>
@@ -4256,6 +4823,18 @@
         </w:numPr>
       </w:pPr>
       <w:r>
+        <w:t xml:space="preserve">Manually verified in the running app.</w:t>
+      </w:r>
+    </w:p>
+    <w:p>
+      <w:pPr>
+        <w:pStyle w:val="Compact"/>
+        <w:numPr>
+          <w:ilvl w:val="0"/>
+          <w:numId w:val="1013"/>
+        </w:numPr>
+      </w:pPr>
+      <w:r>
         <w:t xml:space="preserve">No console / stack-trace errors.</w:t>
       </w:r>
     </w:p>
@@ -4266,14 +4845,47 @@
         </w:pict>
       </w:r>
     </w:p>
-    <w:bookmarkEnd w:id="30"/>
-    <w:bookmarkStart w:id="31" w:name="cheat-sheet"/>
+    <w:bookmarkEnd w:id="19"/>
+    <w:bookmarkStart w:id="20" w:name="Xd823b78e5b361b345122cd51aaf2adc0fe5079c"/>
     <w:p>
       <w:pPr>
         <w:pStyle w:val="Heading1"/>
       </w:pPr>
       <w:r>
-        <w:t xml:space="preserve">9. Cheat sheet</w:t>
+        <w:t xml:space="preserve">8b. Pull request scope &amp; hygiene</w:t>
+      </w:r>
+    </w:p>
+    <w:p>
+      <w:pPr>
+        <w:pStyle w:val="FirstParagraph"/>
+      </w:pPr>
+      <w:r>
+        <w:t xml:space="preserve">Every PR is reviewed by the integrator before it merges to</w:t>
+      </w:r>
+      <w:r>
+        <w:t xml:space="preserve"> </w:t>
+      </w:r>
+      <w:r>
+        <w:rPr>
+          <w:rStyle w:val="VerbatimChar"/>
+        </w:rPr>
+        <w:t xml:space="preserve">main</w:t>
+      </w:r>
+      <w:r>
+        <w:t xml:space="preserve">. To keep reviews fast and reverts painless, a PR must stay</w:t>
+      </w:r>
+      <w:r>
+        <w:t xml:space="preserve"> </w:t>
+      </w:r>
+      <w:r>
+        <w:rPr>
+          <w:b/>
+          <w:bCs/>
+        </w:rPr>
+        <w:t xml:space="preserve">inside its own lane</w:t>
+      </w:r>
+      <w:r>
+        <w:t xml:space="preserve">:</w:t>
       </w:r>
     </w:p>
     <w:p>
@@ -4289,83 +4901,70 @@
           <w:b/>
           <w:bCs/>
         </w:rPr>
-        <w:t xml:space="preserve">DB</w:t>
-      </w:r>
-      <w:r>
-        <w:t xml:space="preserve"> </w:t>
-      </w:r>
-      <w:r>
-        <w:rPr>
-          <w:rStyle w:val="VerbatimChar"/>
-        </w:rPr>
-        <w:t xml:space="preserve">snake_case</w:t>
-      </w:r>
-      <w:r>
-        <w:t xml:space="preserve">, plural tables,</w:t>
-      </w:r>
-      <w:r>
-        <w:t xml:space="preserve"> </w:t>
-      </w:r>
-      <w:r>
-        <w:rPr>
-          <w:rStyle w:val="VerbatimChar"/>
-        </w:rPr>
-        <w:t xml:space="preserve">id</w:t>
-      </w:r>
-      <w:r>
-        <w:t xml:space="preserve"> </w:t>
-      </w:r>
-      <w:r>
-        <w:t xml:space="preserve">PK,</w:t>
-      </w:r>
-      <w:r>
-        <w:t xml:space="preserve"> </w:t>
-      </w:r>
-      <w:r>
-        <w:rPr>
-          <w:rStyle w:val="VerbatimChar"/>
-        </w:rPr>
-        <w:t xml:space="preserve">&lt;entity&gt;_id</w:t>
-      </w:r>
-      <w:r>
-        <w:t xml:space="preserve"> </w:t>
-      </w:r>
-      <w:r>
-        <w:t xml:space="preserve">FK ·</w:t>
-      </w:r>
-      <w:r>
-        <w:t xml:space="preserve"> </w:t>
-      </w:r>
-      <w:r>
-        <w:rPr>
-          <w:b/>
-          <w:bCs/>
-        </w:rPr>
-        <w:t xml:space="preserve">JSON</w:t>
-      </w:r>
-      <w:r>
-        <w:t xml:space="preserve"> </w:t>
-      </w:r>
-      <w:r>
-        <w:rPr>
-          <w:rStyle w:val="VerbatimChar"/>
-        </w:rPr>
-        <w:t xml:space="preserve">camelCase</w:t>
-      </w:r>
-      <w:r>
-        <w:t xml:space="preserve">, enums</w:t>
-      </w:r>
-      <w:r>
-        <w:t xml:space="preserve"> </w:t>
-      </w:r>
-      <w:r>
-        <w:rPr>
-          <w:rStyle w:val="VerbatimChar"/>
-        </w:rPr>
-        <w:t xml:space="preserve">UPPERCASE</w:t>
-      </w:r>
-      <w:r>
-        <w:t xml:space="preserve">.</w:t>
+        <w:t xml:space="preserve">Touch only your package.</w:t>
+      </w:r>
+      <w:r>
+        <w:t xml:space="preserve"> </w:t>
+      </w:r>
+      <w:r>
+        <w:t xml:space="preserve">A PR changes files in the module you own (</w:t>
+      </w:r>
+      <w:r>
+        <w:rPr>
+          <w:rStyle w:val="VerbatimChar"/>
+        </w:rPr>
+        <w:t xml:space="preserve">identity/</w:t>
+      </w:r>
+      <w:r>
+        <w:t xml:space="preserve">,</w:t>
+      </w:r>
+      <w:r>
+        <w:t xml:space="preserve"> </w:t>
+      </w:r>
+      <w:r>
+        <w:rPr>
+          <w:rStyle w:val="VerbatimChar"/>
+        </w:rPr>
+        <w:t xml:space="preserve">problem/</w:t>
+      </w:r>
+      <w:r>
+        <w:t xml:space="preserve">,</w:t>
+      </w:r>
+      <w:r>
+        <w:t xml:space="preserve"> </w:t>
+      </w:r>
+      <w:r>
+        <w:rPr>
+          <w:rStyle w:val="VerbatimChar"/>
+        </w:rPr>
+        <w:t xml:space="preserve">submission/</w:t>
+      </w:r>
+      <w:r>
+        <w:t xml:space="preserve">,</w:t>
+      </w:r>
+      <w:r>
+        <w:t xml:space="preserve"> </w:t>
+      </w:r>
+      <w:r>
+        <w:rPr>
+          <w:rStyle w:val="VerbatimChar"/>
+        </w:rPr>
+        <w:t xml:space="preserve">contest/</w:t>
+      </w:r>
+      <w:r>
+        <w:t xml:space="preserve">,</w:t>
+      </w:r>
+      <w:r>
+        <w:t xml:space="preserve"> </w:t>
+      </w:r>
+      <w:r>
+        <w:rPr>
+          <w:rStyle w:val="VerbatimChar"/>
+        </w:rPr>
+        <w:t xml:space="preserve">ws/</w:t>
+      </w:r>
+      <w:r>
+        <w:t xml:space="preserve">, or your Angular slice). If you think you need to change someone else's file, ask first — usually the real fix is a service bean or a contract change, not editing their code.</w:t>
       </w:r>
     </w:p>
     <w:p>
@@ -4381,37 +4980,64 @@
           <w:b/>
           <w:bCs/>
         </w:rPr>
-        <w:t xml:space="preserve">Java</w:t>
-      </w:r>
-      <w:r>
-        <w:t xml:space="preserve"> </w:t>
-      </w:r>
-      <w:r>
-        <w:rPr>
-          <w:rStyle w:val="VerbatimChar"/>
-        </w:rPr>
-        <w:t xml:space="preserve">PascalCase</w:t>
-      </w:r>
-      <w:r>
-        <w:t xml:space="preserve"> </w:t>
-      </w:r>
-      <w:r>
-        <w:t xml:space="preserve">classes with</w:t>
-      </w:r>
-      <w:r>
-        <w:t xml:space="preserve"> </w:t>
-      </w:r>
-      <w:r>
-        <w:rPr>
-          <w:rStyle w:val="VerbatimChar"/>
-        </w:rPr>
-        <w:t xml:space="preserve">Controller/Service/Repository</w:t>
-      </w:r>
-      <w:r>
-        <w:t xml:space="preserve"> </w:t>
-      </w:r>
-      <w:r>
-        <w:t xml:space="preserve">suffix · constructor injection · DTOs at the boundary, never raw entities.</w:t>
+        <w:t xml:space="preserve">Nothing at the repo root.</w:t>
+      </w:r>
+      <w:r>
+        <w:t xml:space="preserve"> </w:t>
+      </w:r>
+      <w:r>
+        <w:t xml:space="preserve">The Angular app lives under</w:t>
+      </w:r>
+      <w:r>
+        <w:t xml:space="preserve"> </w:t>
+      </w:r>
+      <w:r>
+        <w:rPr>
+          <w:rStyle w:val="VerbatimChar"/>
+        </w:rPr>
+        <w:t xml:space="preserve">frontend/</w:t>
+      </w:r>
+      <w:r>
+        <w:t xml:space="preserve">. Loose</w:t>
+      </w:r>
+      <w:r>
+        <w:t xml:space="preserve"> </w:t>
+      </w:r>
+      <w:r>
+        <w:rPr>
+          <w:rStyle w:val="VerbatimChar"/>
+        </w:rPr>
+        <w:t xml:space="preserve">.html</w:t>
+      </w:r>
+      <w:r>
+        <w:t xml:space="preserve">,</w:t>
+      </w:r>
+      <w:r>
+        <w:t xml:space="preserve"> </w:t>
+      </w:r>
+      <w:r>
+        <w:rPr>
+          <w:rStyle w:val="VerbatimChar"/>
+        </w:rPr>
+        <w:t xml:space="preserve">.css</w:t>
+      </w:r>
+      <w:r>
+        <w:t xml:space="preserve">, or</w:t>
+      </w:r>
+      <w:r>
+        <w:t xml:space="preserve"> </w:t>
+      </w:r>
+      <w:r>
+        <w:rPr>
+          <w:rStyle w:val="VerbatimChar"/>
+        </w:rPr>
+        <w:t xml:space="preserve">.md</w:t>
+      </w:r>
+      <w:r>
+        <w:t xml:space="preserve"> </w:t>
+      </w:r>
+      <w:r>
+        <w:t xml:space="preserve">files at the top level do not belong in the repo and are git-ignored — if a prototype or mockup helped you, keep it outside the repo.</w:t>
       </w:r>
     </w:p>
     <w:p>
@@ -4427,37 +5053,40 @@
           <w:b/>
           <w:bCs/>
         </w:rPr>
-        <w:t xml:space="preserve">MVC</w:t>
-      </w:r>
-      <w:r>
-        <w:t xml:space="preserve"> </w:t>
-      </w:r>
-      <w:r>
-        <w:t xml:space="preserve">Model = JPA entities + repositories + services · View = Angular SPA + JSON · Controller = thin</w:t>
-      </w:r>
-      <w:r>
-        <w:t xml:space="preserve"> </w:t>
-      </w:r>
-      <w:r>
-        <w:rPr>
-          <w:rStyle w:val="VerbatimChar"/>
-        </w:rPr>
-        <w:t xml:space="preserve">@RestController</w:t>
-      </w:r>
-      <w:r>
-        <w:t xml:space="preserve">. Within the Model tier layer</w:t>
-      </w:r>
-      <w:r>
-        <w:t xml:space="preserve"> </w:t>
-      </w:r>
-      <w:r>
-        <w:rPr>
-          <w:rStyle w:val="VerbatimChar"/>
-        </w:rPr>
-        <w:t xml:space="preserve">Service → Repository</w:t>
-      </w:r>
-      <w:r>
-        <w:t xml:space="preserve">; no logic in controllers, no queries outside repositories.</w:t>
+        <w:t xml:space="preserve">No private / internal docs.</w:t>
+      </w:r>
+      <w:r>
+        <w:t xml:space="preserve"> </w:t>
+      </w:r>
+      <w:r>
+        <w:t xml:space="preserve">Onboarding, working manual, journal, trackers, SRS,</w:t>
+      </w:r>
+      <w:r>
+        <w:t xml:space="preserve"> </w:t>
+      </w:r>
+      <w:r>
+        <w:rPr>
+          <w:rStyle w:val="VerbatimChar"/>
+        </w:rPr>
+        <w:t xml:space="preserve">.xlsx</w:t>
+      </w:r>
+      <w:r>
+        <w:t xml:space="preserve">,</w:t>
+      </w:r>
+      <w:r>
+        <w:t xml:space="preserve"> </w:t>
+      </w:r>
+      <w:r>
+        <w:rPr>
+          <w:rStyle w:val="VerbatimChar"/>
+        </w:rPr>
+        <w:t xml:space="preserve">.env</w:t>
+      </w:r>
+      <w:r>
+        <w:t xml:space="preserve"> </w:t>
+      </w:r>
+      <w:r>
+        <w:t xml:space="preserve">— none of these are ever committed. They are shared separately.</w:t>
       </w:r>
     </w:p>
     <w:p>
@@ -4473,61 +5102,31 @@
           <w:b/>
           <w:bCs/>
         </w:rPr>
-        <w:t xml:space="preserve">API</w:t>
-      </w:r>
-      <w:r>
-        <w:t xml:space="preserve"> </w:t>
-      </w:r>
-      <w:r>
-        <w:t xml:space="preserve">shapes are fixed in</w:t>
-      </w:r>
-      <w:r>
-        <w:t xml:space="preserve"> </w:t>
-      </w:r>
-      <w:r>
-        <w:rPr>
-          <w:rStyle w:val="VerbatimChar"/>
-        </w:rPr>
-        <w:t xml:space="preserve">api-contracts.md</w:t>
-      </w:r>
-      <w:r>
-        <w:t xml:space="preserve">. Base</w:t>
-      </w:r>
-      <w:r>
-        <w:t xml:space="preserve"> </w:t>
-      </w:r>
-      <w:r>
-        <w:rPr>
-          <w:rStyle w:val="VerbatimChar"/>
-        </w:rPr>
-        <w:t xml:space="preserve">/api</w:t>
-      </w:r>
-      <w:r>
-        <w:t xml:space="preserve">, Bearer JWT, ISO-8601 UTC, error</w:t>
-      </w:r>
-      <w:r>
-        <w:t xml:space="preserve"> </w:t>
-      </w:r>
-      <w:r>
-        <w:rPr>
-          <w:rStyle w:val="VerbatimChar"/>
-        </w:rPr>
-        <w:t xml:space="preserve">{error,status}</w:t>
-      </w:r>
-      <w:r>
-        <w:t xml:space="preserve">, pages</w:t>
-      </w:r>
-      <w:r>
-        <w:t xml:space="preserve"> </w:t>
-      </w:r>
-      <w:r>
-        <w:rPr>
-          <w:rStyle w:val="VerbatimChar"/>
-        </w:rPr>
-        <w:t xml:space="preserve">{content,page,size,totalElements}</w:t>
-      </w:r>
-      <w:r>
-        <w:t xml:space="preserve">.</w:t>
+        <w:t xml:space="preserve">Shared files are additive-only.</w:t>
+      </w:r>
+      <w:r>
+        <w:t xml:space="preserve"> </w:t>
+      </w:r>
+      <w:r>
+        <w:rPr>
+          <w:rStyle w:val="VerbatimChar"/>
+        </w:rPr>
+        <w:t xml:space="preserve">styles.scss</w:t>
+      </w:r>
+      <w:r>
+        <w:t xml:space="preserve">,</w:t>
+      </w:r>
+      <w:r>
+        <w:t xml:space="preserve"> </w:t>
+      </w:r>
+      <w:r>
+        <w:rPr>
+          <w:rStyle w:val="VerbatimChar"/>
+        </w:rPr>
+        <w:t xml:space="preserve">app.routes.ts</w:t>
+      </w:r>
+      <w:r>
+        <w:t xml:space="preserve">, and other shared files: add your lines, never rewrite the file. A wholesale rewrite clobbers everyone else's work and blocks the merge.</w:t>
       </w:r>
     </w:p>
     <w:p>
@@ -4543,13 +5142,47 @@
           <w:b/>
           <w:bCs/>
         </w:rPr>
-        <w:t xml:space="preserve">Integration</w:t>
-      </w:r>
-      <w:r>
-        <w:t xml:space="preserve"> </w:t>
-      </w:r>
-      <w:r>
-        <w:t xml:space="preserve">engine reads DB directly · cross-module = service beans, never HTTP · validate role server-side on every write.</w:t>
+        <w:t xml:space="preserve">One concern per PR.</w:t>
+      </w:r>
+      <w:r>
+        <w:t xml:space="preserve"> </w:t>
+      </w:r>
+      <w:r>
+        <w:t xml:space="preserve">A single feature or fix. A 20-file PR mixing four features is unreviewable and gets sent back — split it.</w:t>
+      </w:r>
+    </w:p>
+    <w:p>
+      <w:pPr>
+        <w:pStyle w:val="FirstParagraph"/>
+      </w:pPr>
+      <w:r>
+        <w:t xml:space="preserve">The PR template (</w:t>
+      </w:r>
+      <w:r>
+        <w:rPr>
+          <w:rStyle w:val="VerbatimChar"/>
+        </w:rPr>
+        <w:t xml:space="preserve">.github/pull_request_template.md</w:t>
+      </w:r>
+      <w:r>
+        <w:t xml:space="preserve">) is this list as a checklist. Tick every box before requesting review.</w:t>
+      </w:r>
+    </w:p>
+    <w:p>
+      <w:r>
+        <w:pict>
+          <v:rect style="width:0;height:1.5pt" o:hralign="center" o:hrstd="t" o:hr="t"/>
+        </w:pict>
+      </w:r>
+    </w:p>
+    <w:bookmarkEnd w:id="20"/>
+    <w:bookmarkStart w:id="21" w:name="X02f35e3525ac7a7fd31e61602fc0f264685cdf5"/>
+    <w:p>
+      <w:pPr>
+        <w:pStyle w:val="Heading1"/>
+      </w:pPr>
+      <w:r>
+        <w:t xml:space="preserve">9. Cheat sheet</w:t>
       </w:r>
     </w:p>
     <w:p>
@@ -4557,7 +5190,7 @@
         <w:pStyle w:val="Compact"/>
         <w:numPr>
           <w:ilvl w:val="0"/>
-          <w:numId w:val="1014"/>
+          <w:numId w:val="1015"/>
         </w:numPr>
       </w:pPr>
       <w:r>
@@ -4565,58 +5198,83 @@
           <w:b/>
           <w:bCs/>
         </w:rPr>
-        <w:t xml:space="preserve">Git</w:t>
-      </w:r>
-      <w:r>
-        <w:t xml:space="preserve"> </w:t>
-      </w:r>
-      <w:r>
-        <w:t xml:space="preserve">branch</w:t>
-      </w:r>
-      <w:r>
-        <w:t xml:space="preserve"> </w:t>
-      </w:r>
-      <w:r>
-        <w:rPr>
-          <w:rStyle w:val="VerbatimChar"/>
-        </w:rPr>
-        <w:t xml:space="preserve">type/kebab-task</w:t>
-      </w:r>
-      <w:r>
-        <w:t xml:space="preserve"> </w:t>
-      </w:r>
-      <w:r>
-        <w:t xml:space="preserve">· never commit to</w:t>
-      </w:r>
-      <w:r>
-        <w:t xml:space="preserve"> </w:t>
-      </w:r>
-      <w:r>
-        <w:rPr>
-          <w:rStyle w:val="VerbatimChar"/>
-        </w:rPr>
-        <w:t xml:space="preserve">main</w:t>
-      </w:r>
-      <w:r>
-        <w:t xml:space="preserve"> </w:t>
-      </w:r>
-      <w:r>
-        <w:t xml:space="preserve">· PR reviewed by someone else · commit</w:t>
-      </w:r>
-      <w:r>
-        <w:t xml:space="preserve"> </w:t>
-      </w:r>
-      <w:r>
-        <w:rPr>
-          <w:rStyle w:val="VerbatimChar"/>
-        </w:rPr>
-        <w:t xml:space="preserve">type: summary</w:t>
-      </w:r>
-      <w:r>
-        <w:t xml:space="preserve"> </w:t>
-      </w:r>
-      <w:r>
-        <w:t xml:space="preserve">≤50 chars.</w:t>
+        <w:t xml:space="preserve">DB</w:t>
+      </w:r>
+      <w:r>
+        <w:t xml:space="preserve"> </w:t>
+      </w:r>
+      <w:r>
+        <w:rPr>
+          <w:rStyle w:val="VerbatimChar"/>
+        </w:rPr>
+        <w:t xml:space="preserve">snake_case</w:t>
+      </w:r>
+      <w:r>
+        <w:t xml:space="preserve">, plural tables,</w:t>
+      </w:r>
+      <w:r>
+        <w:t xml:space="preserve"> </w:t>
+      </w:r>
+      <w:r>
+        <w:rPr>
+          <w:rStyle w:val="VerbatimChar"/>
+        </w:rPr>
+        <w:t xml:space="preserve">id</w:t>
+      </w:r>
+      <w:r>
+        <w:t xml:space="preserve"> </w:t>
+      </w:r>
+      <w:r>
+        <w:t xml:space="preserve">PK,</w:t>
+      </w:r>
+      <w:r>
+        <w:t xml:space="preserve"> </w:t>
+      </w:r>
+      <w:r>
+        <w:rPr>
+          <w:rStyle w:val="VerbatimChar"/>
+        </w:rPr>
+        <w:t xml:space="preserve">&lt;entity&gt;_id</w:t>
+      </w:r>
+      <w:r>
+        <w:t xml:space="preserve"> </w:t>
+      </w:r>
+      <w:r>
+        <w:t xml:space="preserve">FK ·</w:t>
+      </w:r>
+      <w:r>
+        <w:t xml:space="preserve"> </w:t>
+      </w:r>
+      <w:r>
+        <w:rPr>
+          <w:b/>
+          <w:bCs/>
+        </w:rPr>
+        <w:t xml:space="preserve">JSON</w:t>
+      </w:r>
+      <w:r>
+        <w:t xml:space="preserve"> </w:t>
+      </w:r>
+      <w:r>
+        <w:rPr>
+          <w:rStyle w:val="VerbatimChar"/>
+        </w:rPr>
+        <w:t xml:space="preserve">camelCase</w:t>
+      </w:r>
+      <w:r>
+        <w:t xml:space="preserve">, enums</w:t>
+      </w:r>
+      <w:r>
+        <w:t xml:space="preserve"> </w:t>
+      </w:r>
+      <w:r>
+        <w:rPr>
+          <w:rStyle w:val="VerbatimChar"/>
+        </w:rPr>
+        <w:t xml:space="preserve">UPPERCASE</w:t>
+      </w:r>
+      <w:r>
+        <w:t xml:space="preserve">.</w:t>
       </w:r>
     </w:p>
     <w:p>
@@ -4624,7 +5282,7 @@
         <w:pStyle w:val="Compact"/>
         <w:numPr>
           <w:ilvl w:val="0"/>
-          <w:numId w:val="1014"/>
+          <w:numId w:val="1015"/>
         </w:numPr>
       </w:pPr>
       <w:r>
@@ -4632,37 +5290,37 @@
           <w:b/>
           <w:bCs/>
         </w:rPr>
-        <w:t xml:space="preserve">Docker</w:t>
-      </w:r>
-      <w:r>
-        <w:t xml:space="preserve"> </w:t>
-      </w:r>
-      <w:r>
-        <w:rPr>
-          <w:rStyle w:val="VerbatimChar"/>
-        </w:rPr>
-        <w:t xml:space="preserve">docker compose up</w:t>
-      </w:r>
-      <w:r>
-        <w:t xml:space="preserve"> </w:t>
-      </w:r>
-      <w:r>
-        <w:t xml:space="preserve">must stay green · sandbox = no network + hard limits + destroy after run · secrets via env,</w:t>
-      </w:r>
-      <w:r>
-        <w:t xml:space="preserve"> </w:t>
-      </w:r>
-      <w:r>
-        <w:rPr>
-          <w:rStyle w:val="VerbatimChar"/>
-        </w:rPr>
-        <w:t xml:space="preserve">.env</w:t>
-      </w:r>
-      <w:r>
-        <w:t xml:space="preserve"> </w:t>
-      </w:r>
-      <w:r>
-        <w:t xml:space="preserve">git-ignored.</w:t>
+        <w:t xml:space="preserve">Java</w:t>
+      </w:r>
+      <w:r>
+        <w:t xml:space="preserve"> </w:t>
+      </w:r>
+      <w:r>
+        <w:rPr>
+          <w:rStyle w:val="VerbatimChar"/>
+        </w:rPr>
+        <w:t xml:space="preserve">PascalCase</w:t>
+      </w:r>
+      <w:r>
+        <w:t xml:space="preserve"> </w:t>
+      </w:r>
+      <w:r>
+        <w:t xml:space="preserve">classes with</w:t>
+      </w:r>
+      <w:r>
+        <w:t xml:space="preserve"> </w:t>
+      </w:r>
+      <w:r>
+        <w:rPr>
+          <w:rStyle w:val="VerbatimChar"/>
+        </w:rPr>
+        <w:t xml:space="preserve">Controller/Service/Repository</w:t>
+      </w:r>
+      <w:r>
+        <w:t xml:space="preserve"> </w:t>
+      </w:r>
+      <w:r>
+        <w:t xml:space="preserve">suffix · constructor injection · DTOs at the boundary, never raw entities.</w:t>
       </w:r>
     </w:p>
     <w:p>
@@ -4670,7 +5328,7 @@
         <w:pStyle w:val="Compact"/>
         <w:numPr>
           <w:ilvl w:val="0"/>
-          <w:numId w:val="1014"/>
+          <w:numId w:val="1015"/>
         </w:numPr>
       </w:pPr>
       <w:r>
@@ -4678,16 +5336,428 @@
           <w:b/>
           <w:bCs/>
         </w:rPr>
+        <w:t xml:space="preserve">MVC</w:t>
+      </w:r>
+      <w:r>
+        <w:t xml:space="preserve"> </w:t>
+      </w:r>
+      <w:r>
+        <w:t xml:space="preserve">Model = JPA entities + repositories + services · View = Angular SPA + JSON · Controller = thin</w:t>
+      </w:r>
+      <w:r>
+        <w:t xml:space="preserve"> </w:t>
+      </w:r>
+      <w:r>
+        <w:rPr>
+          <w:rStyle w:val="VerbatimChar"/>
+        </w:rPr>
+        <w:t xml:space="preserve">@RestController</w:t>
+      </w:r>
+      <w:r>
+        <w:t xml:space="preserve">. Within the Model tier layer</w:t>
+      </w:r>
+      <w:r>
+        <w:t xml:space="preserve"> </w:t>
+      </w:r>
+      <w:r>
+        <w:rPr>
+          <w:rStyle w:val="VerbatimChar"/>
+        </w:rPr>
+        <w:t xml:space="preserve">Service → Repository</w:t>
+      </w:r>
+      <w:r>
+        <w:t xml:space="preserve">; no logic in controllers, no queries outside repositories.</w:t>
+      </w:r>
+    </w:p>
+    <w:p>
+      <w:pPr>
+        <w:pStyle w:val="Compact"/>
+        <w:numPr>
+          <w:ilvl w:val="0"/>
+          <w:numId w:val="1015"/>
+        </w:numPr>
+      </w:pPr>
+      <w:r>
+        <w:rPr>
+          <w:b/>
+          <w:bCs/>
+        </w:rPr>
+        <w:t xml:space="preserve">API</w:t>
+      </w:r>
+      <w:r>
+        <w:t xml:space="preserve"> </w:t>
+      </w:r>
+      <w:r>
+        <w:t xml:space="preserve">shapes are fixed in</w:t>
+      </w:r>
+      <w:r>
+        <w:t xml:space="preserve"> </w:t>
+      </w:r>
+      <w:r>
+        <w:rPr>
+          <w:rStyle w:val="VerbatimChar"/>
+        </w:rPr>
+        <w:t xml:space="preserve">api-contracts.md</w:t>
+      </w:r>
+      <w:r>
+        <w:t xml:space="preserve">. Base</w:t>
+      </w:r>
+      <w:r>
+        <w:t xml:space="preserve"> </w:t>
+      </w:r>
+      <w:r>
+        <w:rPr>
+          <w:rStyle w:val="VerbatimChar"/>
+        </w:rPr>
+        <w:t xml:space="preserve">/api</w:t>
+      </w:r>
+      <w:r>
+        <w:t xml:space="preserve">, Bearer JWT, ISO-8601 UTC, error</w:t>
+      </w:r>
+      <w:r>
+        <w:t xml:space="preserve"> </w:t>
+      </w:r>
+      <w:r>
+        <w:rPr>
+          <w:rStyle w:val="VerbatimChar"/>
+        </w:rPr>
+        <w:t xml:space="preserve">{error,status}</w:t>
+      </w:r>
+      <w:r>
+        <w:t xml:space="preserve">, pages</w:t>
+      </w:r>
+      <w:r>
+        <w:t xml:space="preserve"> </w:t>
+      </w:r>
+      <w:r>
+        <w:rPr>
+          <w:rStyle w:val="VerbatimChar"/>
+        </w:rPr>
+        <w:t xml:space="preserve">{content,page,size,totalElements}</w:t>
+      </w:r>
+      <w:r>
+        <w:t xml:space="preserve">.</w:t>
+      </w:r>
+    </w:p>
+    <w:p>
+      <w:pPr>
+        <w:pStyle w:val="Compact"/>
+        <w:numPr>
+          <w:ilvl w:val="0"/>
+          <w:numId w:val="1015"/>
+        </w:numPr>
+      </w:pPr>
+      <w:r>
+        <w:rPr>
+          <w:b/>
+          <w:bCs/>
+        </w:rPr>
+        <w:t xml:space="preserve">Integration</w:t>
+      </w:r>
+      <w:r>
+        <w:t xml:space="preserve"> </w:t>
+      </w:r>
+      <w:r>
+        <w:t xml:space="preserve">engine reads DB directly · cross-module = service beans, never HTTP · validate role server-side on every write.</w:t>
+      </w:r>
+    </w:p>
+    <w:p>
+      <w:pPr>
+        <w:pStyle w:val="Compact"/>
+        <w:numPr>
+          <w:ilvl w:val="0"/>
+          <w:numId w:val="1015"/>
+        </w:numPr>
+      </w:pPr>
+      <w:r>
+        <w:rPr>
+          <w:b/>
+          <w:bCs/>
+        </w:rPr>
+        <w:t xml:space="preserve">Git</w:t>
+      </w:r>
+      <w:r>
+        <w:t xml:space="preserve"> </w:t>
+      </w:r>
+      <w:r>
+        <w:t xml:space="preserve">branch</w:t>
+      </w:r>
+      <w:r>
+        <w:t xml:space="preserve"> </w:t>
+      </w:r>
+      <w:r>
+        <w:rPr>
+          <w:rStyle w:val="VerbatimChar"/>
+        </w:rPr>
+        <w:t xml:space="preserve">type/kebab-task</w:t>
+      </w:r>
+      <w:r>
+        <w:t xml:space="preserve"> </w:t>
+      </w:r>
+      <w:r>
+        <w:t xml:space="preserve">· never commit to</w:t>
+      </w:r>
+      <w:r>
+        <w:t xml:space="preserve"> </w:t>
+      </w:r>
+      <w:r>
+        <w:rPr>
+          <w:rStyle w:val="VerbatimChar"/>
+        </w:rPr>
+        <w:t xml:space="preserve">main</w:t>
+      </w:r>
+      <w:r>
+        <w:t xml:space="preserve"> </w:t>
+      </w:r>
+      <w:r>
+        <w:t xml:space="preserve">·</w:t>
+      </w:r>
+      <w:r>
+        <w:t xml:space="preserve"> </w:t>
+      </w:r>
+      <w:r>
+        <w:rPr>
+          <w:b/>
+          <w:bCs/>
+        </w:rPr>
+        <w:t xml:space="preserve">CI green (3 jobs) or it doesn't merge</w:t>
+      </w:r>
+      <w:r>
+        <w:t xml:space="preserve"> </w:t>
+      </w:r>
+      <w:r>
+        <w:t xml:space="preserve">· PR reviewed by someone else · commit</w:t>
+      </w:r>
+      <w:r>
+        <w:t xml:space="preserve"> </w:t>
+      </w:r>
+      <w:r>
+        <w:rPr>
+          <w:rStyle w:val="VerbatimChar"/>
+        </w:rPr>
+        <w:t xml:space="preserve">type: summary</w:t>
+      </w:r>
+      <w:r>
+        <w:t xml:space="preserve"> </w:t>
+      </w:r>
+      <w:r>
+        <w:t xml:space="preserve">≤50 chars.</w:t>
+      </w:r>
+    </w:p>
+    <w:p>
+      <w:pPr>
+        <w:pStyle w:val="Compact"/>
+        <w:numPr>
+          <w:ilvl w:val="0"/>
+          <w:numId w:val="1015"/>
+        </w:numPr>
+      </w:pPr>
+      <w:r>
+        <w:rPr>
+          <w:b/>
+          <w:bCs/>
+        </w:rPr>
+        <w:t xml:space="preserve">PR scope</w:t>
+      </w:r>
+      <w:r>
+        <w:t xml:space="preserve"> </w:t>
+      </w:r>
+      <w:r>
+        <w:t xml:space="preserve">only your package's files · nothing at repo root · no private docs /</w:t>
+      </w:r>
+      <w:r>
+        <w:t xml:space="preserve"> </w:t>
+      </w:r>
+      <w:r>
+        <w:rPr>
+          <w:rStyle w:val="VerbatimChar"/>
+        </w:rPr>
+        <w:t xml:space="preserve">.env</w:t>
+      </w:r>
+      <w:r>
+        <w:t xml:space="preserve"> </w:t>
+      </w:r>
+      <w:r>
+        <w:t xml:space="preserve">· shared files additive-only · one concern per PR.</w:t>
+      </w:r>
+    </w:p>
+    <w:p>
+      <w:pPr>
+        <w:pStyle w:val="Compact"/>
+        <w:numPr>
+          <w:ilvl w:val="0"/>
+          <w:numId w:val="1015"/>
+        </w:numPr>
+      </w:pPr>
+      <w:r>
+        <w:rPr>
+          <w:b/>
+          <w:bCs/>
+        </w:rPr>
+        <w:t xml:space="preserve">Docker</w:t>
+      </w:r>
+      <w:r>
+        <w:t xml:space="preserve"> </w:t>
+      </w:r>
+      <w:r>
+        <w:rPr>
+          <w:rStyle w:val="VerbatimChar"/>
+        </w:rPr>
+        <w:t xml:space="preserve">docker compose up</w:t>
+      </w:r>
+      <w:r>
+        <w:t xml:space="preserve"> </w:t>
+      </w:r>
+      <w:r>
+        <w:t xml:space="preserve">must stay green · sandbox = no network + hard limits +</w:t>
+      </w:r>
+      <w:r>
+        <w:t xml:space="preserve"> </w:t>
+      </w:r>
+      <w:r>
+        <w:rPr>
+          <w:b/>
+          <w:bCs/>
+        </w:rPr>
+        <w:t xml:space="preserve">one container per submission, destroyed after it</w:t>
+      </w:r>
+      <w:r>
+        <w:t xml:space="preserve"> </w:t>
+      </w:r>
+      <w:r>
+        <w:t xml:space="preserve">(</w:t>
+      </w:r>
+      <w:r>
+        <w:rPr>
+          <w:rStyle w:val="VerbatimChar"/>
+        </w:rPr>
+        <w:t xml:space="preserve">SANDBOX_REUSE_CONTAINER=false</w:t>
+      </w:r>
+      <w:r>
+        <w:t xml:space="preserve"> </w:t>
+      </w:r>
+      <w:r>
+        <w:t xml:space="preserve">for one per case) · secrets via env,</w:t>
+      </w:r>
+      <w:r>
+        <w:t xml:space="preserve"> </w:t>
+      </w:r>
+      <w:r>
+        <w:rPr>
+          <w:rStyle w:val="VerbatimChar"/>
+        </w:rPr>
+        <w:t xml:space="preserve">.env</w:t>
+      </w:r>
+      <w:r>
+        <w:t xml:space="preserve"> </w:t>
+      </w:r>
+      <w:r>
+        <w:t xml:space="preserve">git-ignored.</w:t>
+      </w:r>
+    </w:p>
+    <w:p>
+      <w:pPr>
+        <w:pStyle w:val="Compact"/>
+        <w:numPr>
+          <w:ilvl w:val="0"/>
+          <w:numId w:val="1015"/>
+        </w:numPr>
+      </w:pPr>
+      <w:r>
+        <w:rPr>
+          <w:b/>
+          <w:bCs/>
+        </w:rPr>
+        <w:t xml:space="preserve">Frontend</w:t>
+      </w:r>
+      <w:r>
+        <w:t xml:space="preserve"> </w:t>
+      </w:r>
+      <w:r>
+        <w:t xml:space="preserve">every component is OnPush ⇒ every</w:t>
+      </w:r>
+      <w:r>
+        <w:t xml:space="preserve"> </w:t>
+      </w:r>
+      <w:r>
+        <w:rPr>
+          <w:rStyle w:val="VerbatimChar"/>
+        </w:rPr>
+        <w:t xml:space="preserve">subscribe</w:t>
+      </w:r>
+      <w:r>
+        <w:t xml:space="preserve"> </w:t>
+      </w:r>
+      <w:r>
+        <w:t xml:space="preserve">pipes</w:t>
+      </w:r>
+      <w:r>
+        <w:t xml:space="preserve"> </w:t>
+      </w:r>
+      <w:r>
+        <w:rPr>
+          <w:rStyle w:val="VerbatimChar"/>
+        </w:rPr>
+        <w:t xml:space="preserve">markDirty(this.cdr)</w:t>
+      </w:r>
+      <w:r>
+        <w:t xml:space="preserve">; run</w:t>
+      </w:r>
+      <w:r>
+        <w:t xml:space="preserve"> </w:t>
+      </w:r>
+      <w:r>
+        <w:rPr>
+          <w:rStyle w:val="VerbatimChar"/>
+        </w:rPr>
+        <w:t xml:space="preserve">node scripts/check-mark-dirty.mjs</w:t>
+      </w:r>
+      <w:r>
+        <w:t xml:space="preserve"> </w:t>
+      </w:r>
+      <w:r>
+        <w:t xml:space="preserve">before a frontend PR. No unit-test runner in v1.</w:t>
+      </w:r>
+    </w:p>
+    <w:p>
+      <w:pPr>
+        <w:pStyle w:val="Compact"/>
+        <w:numPr>
+          <w:ilvl w:val="0"/>
+          <w:numId w:val="1015"/>
+        </w:numPr>
+      </w:pPr>
+      <w:r>
+        <w:rPr>
+          <w:b/>
+          <w:bCs/>
+        </w:rPr>
         <w:t xml:space="preserve">Done</w:t>
       </w:r>
       <w:r>
         <w:t xml:space="preserve"> </w:t>
       </w:r>
       <w:r>
-        <w:t xml:space="preserve">= merged + reviewed + tested + contract-matched + manually verified + no errors.</w:t>
-      </w:r>
-    </w:p>
-    <w:bookmarkEnd w:id="31"/>
+        <w:t xml:space="preserve">= merged + reviewed + tested +</w:t>
+      </w:r>
+      <w:r>
+        <w:t xml:space="preserve"> </w:t>
+      </w:r>
+      <w:r>
+        <w:rPr>
+          <w:b/>
+          <w:bCs/>
+        </w:rPr>
+        <w:t xml:space="preserve">CI green</w:t>
+      </w:r>
+      <w:r>
+        <w:t xml:space="preserve"> </w:t>
+      </w:r>
+      <w:r>
+        <w:t xml:space="preserve">+ contract-matched + manually verified + no errors.</w:t>
+      </w:r>
+    </w:p>
+    <w:bookmarkEnd w:id="21"/>
     <w:sectPr>
       <w:footnotePr>
         <w:numRestart w:val="eachSect"/>
@@ -5058,6 +6128,9 @@
   <w:num w:numId="1014">
     <w:abstractNumId w:val="991"/>
   </w:num>
+  <w:num w:numId="1015">
+    <w:abstractNumId w:val="991"/>
+  </w:num>
 </w:numbering>
 </file>
 
@@ -5066,10 +6139,10 @@
   <w:docDefaults>
     <w:rPrDefault>
       <w:rPr>
-        <w:rFonts w:asciiTheme="minorHAnsi" w:cstheme="minorBidi" w:eastAsiaTheme="minorHAnsi" w:hAnsiTheme="minorHAnsi"/>
+        <w:rFonts w:asciiTheme="minorHAnsi" w:cstheme="minorBidi" w:eastAsiaTheme="minorEastAsia" w:hAnsiTheme="minorHAnsi"/>
         <w:sz w:val="24"/>
         <w:szCs w:val="24"/>
-        <w:lang w:bidi="ar-SA" w:eastAsia="en-US" w:val="en-US"/>
+        <w:lang w:bidi="ar-SA" w:eastAsia="zh-CN" w:val="en-US"/>
       </w:rPr>
     </w:rPrDefault>
     <w:pPrDefault>
@@ -5121,8 +6194,6 @@
     </w:pPr>
     <w:rPr>
       <w:rFonts w:asciiTheme="majorHAnsi" w:cstheme="majorBidi" w:eastAsiaTheme="majorEastAsia" w:hAnsiTheme="majorHAnsi"/>
-      <w:spacing w:val="-10"/>
-      <w:kern w:val="28"/>
       <w:sz w:val="56"/>
       <w:szCs w:val="56"/>
     </w:rPr>
@@ -5135,8 +6206,6 @@
     <w:rsid w:val="00A10FD9"/>
     <w:rPr>
       <w:rFonts w:asciiTheme="majorHAnsi" w:cstheme="majorBidi" w:eastAsiaTheme="majorEastAsia" w:hAnsiTheme="majorHAnsi"/>
-      <w:spacing w:val="-10"/>
-      <w:kern w:val="28"/>
       <w:sz w:val="56"/>
       <w:szCs w:val="56"/>
     </w:rPr>
@@ -5177,23 +6246,31 @@
   </w:style>
   <w:style w:customStyle="1" w:styleId="Author" w:type="paragraph">
     <w:name w:val="Author"/>
+    <w:basedOn w:val="Title"/>
     <w:next w:val="BodyText"/>
     <w:qFormat/>
     <w:pPr>
       <w:keepNext/>
       <w:keepLines/>
-      <w:jc w:val="center"/>
     </w:pPr>
+    <w:rPr>
+      <w:sz w:val="24"/>
+      <w:szCs w:val="24"/>
+    </w:rPr>
   </w:style>
   <w:style w:styleId="Date" w:type="paragraph">
     <w:name w:val="Date"/>
+    <w:basedOn w:val="Title"/>
     <w:next w:val="BodyText"/>
     <w:qFormat/>
     <w:pPr>
       <w:keepNext/>
       <w:keepLines/>
-      <w:jc w:val="center"/>
     </w:pPr>
+    <w:rPr>
+      <w:sz w:val="24"/>
+      <w:szCs w:val="24"/>
+    </w:rPr>
   </w:style>
   <w:style w:customStyle="1" w:styleId="AbstractTitle" w:type="paragraph">
     <w:name w:val="Abstract Title"/>
@@ -5606,13 +6683,6 @@
       </w:tblCellMar>
     </w:tblPr>
     <w:tblStylePr w:type="firstRow">
-      <w:tblPr>
-        <w:jc w:val="left"/>
-        <w:tblInd w:type="dxa" w:w="0"/>
-      </w:tblPr>
-      <w:trPr>
-        <w:jc w:val="left"/>
-      </w:trPr>
       <w:tcPr>
         <w:tcBorders>
           <w:bottom w:val="single"/>

</xml_diff>

<commit_message>
docs: sync contracts, README and conventions with main (#56)
</commit_message>
<xml_diff>
--- a/docs/CONVENTIONS.docx
+++ b/docs/CONVENTIONS.docx
@@ -26,33 +26,7 @@
         <w:t xml:space="preserve">Version 1.0.0</w:t>
       </w:r>
     </w:p>
-    <w:sdt>
-      <w:sdtPr>
-        <w:docPartObj>
-          <w:docPartGallery w:val="Table of Contents"/>
-          <w:docPartUnique/>
-        </w:docPartObj>
-      </w:sdtPr>
-      <w:sdtContent>
-        <w:p>
-          <w:pPr>
-            <w:pStyle w:val="TOCHeading"/>
-          </w:pPr>
-          <w:r>
-            <w:t xml:space="preserve">Table of Contents</w:t>
-          </w:r>
-        </w:p>
-        <w:p>
-          <w:r>
-            <w:fldChar w:fldCharType="begin" w:dirty="true"/>
-            <w:instrText xml:space="preserve">TOC \o "1-2" \h \z \u</w:instrText>
-            <w:fldChar w:fldCharType="separate"/>
-            <w:fldChar w:fldCharType="end"/>
-          </w:r>
-        </w:p>
-      </w:sdtContent>
-    </w:sdt>
-    <w:bookmarkStart w:id="20" w:name="purpose-scope"/>
+    <w:bookmarkStart w:id="9" w:name="Xc288a453ded2280e55fb33edb20e553b14b34a5"/>
     <w:p>
       <w:pPr>
         <w:pStyle w:val="Heading1"/>
@@ -82,7 +56,7 @@
         <w:t xml:space="preserve"> </w:t>
       </w:r>
       <w:r>
-        <w:t xml:space="preserve">— file structure, naming, coding practices, Git, and Docker. It exists so three people write code that looks like it came from one, and so anyone can drop into anyone else’s module without relearning the rules.</w:t>
+        <w:t xml:space="preserve">— file structure, naming, coding practices, Git, and Docker. It exists so three people write code that looks like it came from one, and so anyone can drop into anyone else's module without relearning the rules.</w:t>
       </w:r>
     </w:p>
     <w:p>
@@ -107,13 +81,23 @@
           <w:b/>
           <w:bCs/>
         </w:rPr>
-        <w:t xml:space="preserve">docs/praetor-team-plan.md</w:t>
-      </w:r>
-      <w:r>
-        <w:t xml:space="preserve"> </w:t>
-      </w:r>
-      <w:r>
-        <w:t xml:space="preserve">— process, sprints, module ownership, Definition of Done.</w:t>
+        <w:t xml:space="preserve">docs/api-contracts.md</w:t>
+      </w:r>
+      <w:r>
+        <w:t xml:space="preserve"> </w:t>
+      </w:r>
+      <w:r>
+        <w:t xml:space="preserve">— the exact endpoint shapes.</w:t>
+      </w:r>
+      <w:r>
+        <w:t xml:space="preserve"> </w:t>
+      </w:r>
+      <w:r>
+        <w:rPr>
+          <w:b/>
+          <w:bCs/>
+        </w:rPr>
+        <w:t xml:space="preserve">Implement them, don't redesign them.</w:t>
       </w:r>
     </w:p>
     <w:p>
@@ -130,39 +114,6 @@
           <w:b/>
           <w:bCs/>
         </w:rPr>
-        <w:t xml:space="preserve">docs/api-contracts.md</w:t>
-      </w:r>
-      <w:r>
-        <w:t xml:space="preserve"> </w:t>
-      </w:r>
-      <w:r>
-        <w:t xml:space="preserve">— the exact endpoint shapes.</w:t>
-      </w:r>
-      <w:r>
-        <w:t xml:space="preserve"> </w:t>
-      </w:r>
-      <w:r>
-        <w:rPr>
-          <w:b/>
-          <w:bCs/>
-        </w:rPr>
-        <w:t xml:space="preserve">Implement them, don’t redesign them.</w:t>
-      </w:r>
-    </w:p>
-    <w:p>
-      <w:pPr>
-        <w:pStyle w:val="Compact"/>
-        <w:numPr>
-          <w:ilvl w:val="0"/>
-          <w:numId w:val="1001"/>
-        </w:numPr>
-      </w:pPr>
-      <w:r>
-        <w:rPr>
-          <w:rStyle w:val="VerbatimChar"/>
-          <w:b/>
-          <w:bCs/>
-        </w:rPr>
         <w:t xml:space="preserve">db/schema.sql</w:t>
       </w:r>
       <w:r>
@@ -177,7 +128,7 @@
         <w:pStyle w:val="FirstParagraph"/>
       </w:pPr>
       <w:r>
-        <w:t xml:space="preserve">If anything here ever conflicts with those three files,</w:t>
+        <w:t xml:space="preserve">The team plan (process, sprints, module ownership, Definition of Done) is shared with the team separately. If anything here ever conflicts with the API contract or schema,</w:t>
       </w:r>
       <w:r>
         <w:t xml:space="preserve"> </w:t>
@@ -203,8 +154,8 @@
         </w:pict>
       </w:r>
     </w:p>
-    <w:bookmarkEnd w:id="20"/>
-    <w:bookmarkStart w:id="21" w:name="repo-file-structure"/>
+    <w:bookmarkEnd w:id="9"/>
+    <w:bookmarkStart w:id="10" w:name="Xd3fc12516c9c1db87a2c8f81e2b62a9b0d63ab8"/>
     <w:p>
       <w:pPr>
         <w:pStyle w:val="Heading1"/>
@@ -257,7 +208,7 @@
         <w:rPr>
           <w:rStyle w:val="VerbatimChar"/>
         </w:rPr>
-        <w:t xml:space="preserve">├── docs/                   # api-contracts, SRS, team-plan, this file</w:t>
+        <w:t xml:space="preserve">├── docs/                   # api-contracts, this file</w:t>
       </w:r>
       <w:r>
         <w:br/>
@@ -553,8 +504,8 @@
         </w:pict>
       </w:r>
     </w:p>
-    <w:bookmarkEnd w:id="21"/>
-    <w:bookmarkStart w:id="22" w:name="naming-conventions"/>
+    <w:bookmarkEnd w:id="10"/>
+    <w:bookmarkStart w:id="11" w:name="Xdc5d4b6cba5467ad283672aeee1014a0e17ef5f"/>
     <w:p>
       <w:pPr>
         <w:pStyle w:val="Heading1"/>
@@ -566,8 +517,7 @@
     <w:tbl>
       <w:tblPr>
         <w:tblStyle w:val="Table"/>
-        <w:tblW w:type="pct" w:w="5000"/>
-        <w:tblLayout w:type="fixed"/>
+        <w:tblW w:type="auto" w:w="0"/>
         <w:tblLook w:firstRow="1" w:lastRow="0" w:firstColumn="0" w:lastColumn="0" w:noHBand="0" w:noVBand="0" w:val="0020"/>
       </w:tblPr>
       <w:tblGrid>
@@ -1985,8 +1935,8 @@
         </w:pict>
       </w:r>
     </w:p>
-    <w:bookmarkEnd w:id="22"/>
-    <w:bookmarkStart w:id="26" w:name="coding-practices"/>
+    <w:bookmarkEnd w:id="11"/>
+    <w:bookmarkStart w:id="15" w:name="X5080f867d2e8482de31e30ab7dc888f4bf061d9"/>
     <w:p>
       <w:pPr>
         <w:pStyle w:val="Heading1"/>
@@ -1995,7 +1945,7 @@
         <w:t xml:space="preserve">4. Coding practices</w:t>
       </w:r>
     </w:p>
-    <w:bookmarkStart w:id="23" w:name="mvc-what-maps-to-what"/>
+    <w:bookmarkStart w:id="12" w:name="X51610140b5065348585df329c5978e53ae29e87"/>
     <w:p>
       <w:pPr>
         <w:pStyle w:val="Heading2"/>
@@ -2022,25 +1972,7 @@
         <w:t xml:space="preserve">Model-View-Controller</w:t>
       </w:r>
       <w:r>
-        <w:t xml:space="preserve"> </w:t>
-      </w:r>
-      <w:r>
-        <w:t xml:space="preserve">(same mapping as</w:t>
-      </w:r>
-      <w:r>
-        <w:t xml:space="preserve"> </w:t>
-      </w:r>
-      <w:r>
-        <w:rPr>
-          <w:rStyle w:val="VerbatimChar"/>
-        </w:rPr>
-        <w:t xml:space="preserve">praetor-team-plan.md</w:t>
-      </w:r>
-      <w:r>
-        <w:t xml:space="preserve"> </w:t>
-      </w:r>
-      <w:r>
-        <w:t xml:space="preserve">§3):</w:t>
+        <w:t xml:space="preserve">:</w:t>
       </w:r>
     </w:p>
     <w:p>
@@ -2225,11 +2157,11 @@
         <w:t xml:space="preserve">internal layering of the Model/business tier</w:t>
       </w:r>
       <w:r>
-        <w:t xml:space="preserve">, not a departure from MVC — it’s how the Model side stays organized. The View (Angular) talks only to Controllers over the API contract.</w:t>
-      </w:r>
-    </w:p>
-    <w:bookmarkEnd w:id="23"/>
-    <w:bookmarkStart w:id="24" w:name="backend-practices-spring"/>
+        <w:t xml:space="preserve">, not a departure from MVC — it's how the Model side stays organized. The View (Angular) talks only to Controllers over the API contract.</w:t>
+      </w:r>
+    </w:p>
+    <w:bookmarkEnd w:id="12"/>
+    <w:bookmarkStart w:id="13" w:name="Xf6dbc69773d74ed929d60a7931f1fcb1012d6f9"/>
     <w:p>
       <w:pPr>
         <w:pStyle w:val="Heading2"/>
@@ -2701,11 +2633,11 @@
         <w:t xml:space="preserve">{ "error": "...", "status": 400 }</w:t>
       </w:r>
       <w:r>
-        <w:t xml:space="preserve">. Don’t hand-write ad-hoc error JSON per controller.</w:t>
-      </w:r>
-    </w:p>
-    <w:bookmarkEnd w:id="24"/>
-    <w:bookmarkStart w:id="25" w:name="frontend-practices-angular"/>
+        <w:t xml:space="preserve">. Don't hand-write ad-hoc error JSON per controller.</w:t>
+      </w:r>
+    </w:p>
+    <w:bookmarkEnd w:id="13"/>
+    <w:bookmarkStart w:id="14" w:name="X8a18d4c1ba4769a5f5d4796971784954f8a49a6"/>
     <w:p>
       <w:pPr>
         <w:pStyle w:val="Heading2"/>
@@ -2883,15 +2815,267 @@
       </w:r>
     </w:p>
     <w:p>
+      <w:pPr>
+        <w:pStyle w:val="Compact"/>
+        <w:numPr>
+          <w:ilvl w:val="0"/>
+          <w:numId w:val="1005"/>
+        </w:numPr>
+      </w:pPr>
+      <w:r>
+        <w:rPr>
+          <w:b/>
+          <w:bCs/>
+        </w:rPr>
+        <w:t xml:space="preserve">Every component is</w:t>
+      </w:r>
+      <w:r>
+        <w:rPr>
+          <w:b/>
+          <w:bCs/>
+        </w:rPr>
+        <w:t xml:space="preserve"> </w:t>
+      </w:r>
+      <w:r>
+        <w:rPr>
+          <w:rStyle w:val="VerbatimChar"/>
+          <w:b/>
+          <w:bCs/>
+        </w:rPr>
+        <w:t xml:space="preserve">ChangeDetectionStrategy.OnPush</w:t>
+      </w:r>
+      <w:r>
+        <w:rPr>
+          <w:b/>
+          <w:bCs/>
+        </w:rPr>
+        <w:t xml:space="preserve">, so every</w:t>
+      </w:r>
+      <w:r>
+        <w:rPr>
+          <w:b/>
+          <w:bCs/>
+        </w:rPr>
+        <w:t xml:space="preserve"> </w:t>
+      </w:r>
+      <w:r>
+        <w:rPr>
+          <w:rStyle w:val="VerbatimChar"/>
+          <w:b/>
+          <w:bCs/>
+        </w:rPr>
+        <w:t xml:space="preserve">subscribe</w:t>
+      </w:r>
+      <w:r>
+        <w:rPr>
+          <w:b/>
+          <w:bCs/>
+        </w:rPr>
+        <w:t xml:space="preserve"> </w:t>
+      </w:r>
+      <w:r>
+        <w:rPr>
+          <w:b/>
+          <w:bCs/>
+        </w:rPr>
+        <w:t xml:space="preserve">pipes</w:t>
+      </w:r>
+      <w:r>
+        <w:rPr>
+          <w:b/>
+          <w:bCs/>
+        </w:rPr>
+        <w:t xml:space="preserve"> </w:t>
+      </w:r>
+      <w:r>
+        <w:rPr>
+          <w:rStyle w:val="VerbatimChar"/>
+          <w:b/>
+          <w:bCs/>
+        </w:rPr>
+        <w:t xml:space="preserve">markDirty(this.cdr)</w:t>
+      </w:r>
+      <w:r>
+        <w:rPr>
+          <w:b/>
+          <w:bCs/>
+        </w:rPr>
+        <w:t xml:space="preserve">.</w:t>
+      </w:r>
+      <w:r>
+        <w:t xml:space="preserve"> </w:t>
+      </w:r>
+      <w:r>
+        <w:t xml:space="preserve">Assigning a field inside a</w:t>
+      </w:r>
+      <w:r>
+        <w:t xml:space="preserve"> </w:t>
+      </w:r>
+      <w:r>
+        <w:rPr>
+          <w:rStyle w:val="VerbatimChar"/>
+        </w:rPr>
+        <w:t xml:space="preserve">subscribe</w:t>
+      </w:r>
+      <w:r>
+        <w:t xml:space="preserve"> </w:t>
+      </w:r>
+      <w:r>
+        <w:t xml:space="preserve">callback is</w:t>
+      </w:r>
+      <w:r>
+        <w:t xml:space="preserve"> </w:t>
+      </w:r>
+      <w:r>
+        <w:rPr>
+          <w:i/>
+          <w:iCs/>
+        </w:rPr>
+        <w:t xml:space="preserve">not</w:t>
+      </w:r>
+      <w:r>
+        <w:t xml:space="preserve"> </w:t>
+      </w:r>
+      <w:r>
+        <w:t xml:space="preserve">one of the things that marks an OnPush</w:t>
+      </w:r>
+      <w:r>
+        <w:t xml:space="preserve"> </w:t>
+      </w:r>
+      <w:r>
+        <w:t xml:space="preserve">component dirty, so a screen can silently stop updating while still compiling and still passing</w:t>
+      </w:r>
+      <w:r>
+        <w:t xml:space="preserve"> </w:t>
+      </w:r>
+      <w:r>
+        <w:t xml:space="preserve">every unit test. The one operator lives in</w:t>
+      </w:r>
+      <w:r>
+        <w:t xml:space="preserve"> </w:t>
+      </w:r>
+      <w:r>
+        <w:rPr>
+          <w:rStyle w:val="VerbatimChar"/>
+        </w:rPr>
+        <w:t xml:space="preserve">core/rx/mark-dirty.ts</w:t>
+      </w:r>
+      <w:r>
+        <w:t xml:space="preserve"> </w:t>
+      </w:r>
+      <w:r>
+        <w:t xml:space="preserve">and is written that way so a</w:t>
+      </w:r>
+      <w:r>
+        <w:t xml:space="preserve"> </w:t>
+      </w:r>
+      <w:r>
+        <w:t xml:space="preserve">missing one can be found mechanically:</w:t>
+      </w:r>
+      <w:r>
+        <w:t xml:space="preserve"> </w:t>
+      </w:r>
+      <w:r>
+        <w:rPr>
+          <w:rStyle w:val="VerbatimChar"/>
+          <w:b/>
+          <w:bCs/>
+        </w:rPr>
+        <w:t xml:space="preserve">node scripts/check-mark-dirty.mjs</w:t>
+      </w:r>
+      <w:r>
+        <w:t xml:space="preserve"> </w:t>
+      </w:r>
+      <w:r>
+        <w:t xml:space="preserve">names</w:t>
+      </w:r>
+      <w:r>
+        <w:t xml:space="preserve"> </w:t>
+      </w:r>
+      <w:r>
+        <w:rPr>
+          <w:rStyle w:val="VerbatimChar"/>
+        </w:rPr>
+        <w:t xml:space="preserve">file:line</w:t>
+      </w:r>
+      <w:r>
+        <w:t xml:space="preserve"> </w:t>
+      </w:r>
+      <w:r>
+        <w:t xml:space="preserve">for any offender and exits non-zero. Three components legitimately call</w:t>
+      </w:r>
+      <w:r>
+        <w:t xml:space="preserve"> </w:t>
+      </w:r>
+      <w:r>
+        <w:rPr>
+          <w:rStyle w:val="VerbatimChar"/>
+        </w:rPr>
+        <w:t xml:space="preserve">markForCheck()</w:t>
+      </w:r>
+      <w:r>
+        <w:t xml:space="preserve"> </w:t>
+      </w:r>
+      <w:r>
+        <w:t xml:space="preserve">directly</w:t>
+      </w:r>
+      <w:r>
+        <w:t xml:space="preserve"> </w:t>
+      </w:r>
+      <w:r>
+        <w:t xml:space="preserve">because their state moves outside any stream (countdown's</w:t>
+      </w:r>
+      <w:r>
+        <w:t xml:space="preserve"> </w:t>
+      </w:r>
+      <w:r>
+        <w:rPr>
+          <w:rStyle w:val="VerbatimChar"/>
+        </w:rPr>
+        <w:t xml:space="preserve">setInterval</w:t>
+      </w:r>
+      <w:r>
+        <w:t xml:space="preserve">, rich-text's lazy KaTeX</w:t>
+      </w:r>
+      <w:r>
+        <w:t xml:space="preserve"> </w:t>
+      </w:r>
+      <w:r>
+        <w:t xml:space="preserve">import, problem-detail's cooldown timer + Monaco load); the script lists those rather than failing</w:t>
+      </w:r>
+      <w:r>
+        <w:t xml:space="preserve"> </w:t>
+      </w:r>
+      <w:r>
+        <w:t xml:space="preserve">them.</w:t>
+      </w:r>
+      <w:r>
+        <w:t xml:space="preserve"> </w:t>
+      </w:r>
+      <w:r>
+        <w:rPr>
+          <w:b/>
+          <w:bCs/>
+        </w:rPr>
+        <w:t xml:space="preserve">Run it before opening a frontend PR</w:t>
+      </w:r>
+      <w:r>
+        <w:t xml:space="preserve"> </w:t>
+      </w:r>
+      <w:r>
+        <w:t xml:space="preserve">— it is not in CI yet.</w:t>
+      </w:r>
+    </w:p>
+    <w:p>
       <w:r>
         <w:pict>
           <v:rect style="width:0;height:1.5pt" o:hralign="center" o:hrstd="t" o:hr="t"/>
         </w:pict>
       </w:r>
     </w:p>
-    <w:bookmarkEnd w:id="25"/>
-    <w:bookmarkEnd w:id="26"/>
-    <w:bookmarkStart w:id="27" w:name="api-contract-discipline"/>
+    <w:bookmarkEnd w:id="14"/>
+    <w:bookmarkEnd w:id="15"/>
+    <w:bookmarkStart w:id="16" w:name="X99a790f35b4a78b950e4bf603d1507f586af7e7"/>
     <w:p>
       <w:pPr>
         <w:pStyle w:val="Heading1"/>
@@ -2940,7 +3124,7 @@
         <w:t xml:space="preserve"> </w:t>
       </w:r>
       <w:r>
-        <w:t xml:space="preserve">Implement them exactly; if a shape genuinely must change, change the contract doc first and tell the team — don’t diverge silently.</w:t>
+        <w:t xml:space="preserve">Implement them exactly; if a shape genuinely must change, change the contract doc first and tell the team — don't diverge silently.</w:t>
       </w:r>
     </w:p>
     <w:p>
@@ -3181,7 +3365,7 @@
         <w:t xml:space="preserve"> </w:t>
       </w:r>
       <w:r>
-        <w:t xml:space="preserve">call another module’s controller. Broken CRUD → seed SQL still fills the tables → judging + demo survive.</w:t>
+        <w:t xml:space="preserve">call another module's controller. Broken CRUD → seed SQL still fills the tables → judging + demo survive.</w:t>
       </w:r>
     </w:p>
     <w:p>
@@ -3209,7 +3393,10 @@
         <w:t xml:space="preserve"> </w:t>
       </w:r>
       <w:r>
-        <w:t xml:space="preserve">(e.g. </w:t>
+        <w:t xml:space="preserve">(e.g.</w:t>
+      </w:r>
+      <w:r>
+        <w:t xml:space="preserve"> </w:t>
       </w:r>
       <w:r>
         <w:rPr>
@@ -3302,8 +3489,8 @@
         </w:pict>
       </w:r>
     </w:p>
-    <w:bookmarkEnd w:id="27"/>
-    <w:bookmarkStart w:id="28" w:name="git-workflow"/>
+    <w:bookmarkEnd w:id="16"/>
+    <w:bookmarkStart w:id="17" w:name="X3a4a5d14121582b3d89b09b778867ba1de4dfb6"/>
     <w:p>
       <w:pPr>
         <w:pStyle w:val="Heading1"/>
@@ -3436,7 +3623,66 @@
         <w:t xml:space="preserve"> </w:t>
       </w:r>
       <w:r>
-        <w:t xml:space="preserve">stays green and demoable at all times.</w:t>
+        <w:t xml:space="preserve">stays green and demoable at all times — and since</w:t>
+      </w:r>
+      <w:r>
+        <w:t xml:space="preserve"> </w:t>
+      </w:r>
+      <w:r>
+        <w:rPr>
+          <w:rStyle w:val="VerbatimChar"/>
+        </w:rPr>
+        <w:t xml:space="preserve">#48</w:t>
+      </w:r>
+      <w:r>
+        <w:t xml:space="preserve"> </w:t>
+      </w:r>
+      <w:r>
+        <w:t xml:space="preserve">that is</w:t>
+      </w:r>
+      <w:r>
+        <w:t xml:space="preserve"> </w:t>
+      </w:r>
+      <w:r>
+        <w:rPr>
+          <w:b/>
+          <w:bCs/>
+        </w:rPr>
+        <w:t xml:space="preserve">machine-checked</w:t>
+      </w:r>
+      <w:r>
+        <w:t xml:space="preserve">:</w:t>
+      </w:r>
+      <w:r>
+        <w:t xml:space="preserve"> </w:t>
+      </w:r>
+      <w:r>
+        <w:rPr>
+          <w:rStyle w:val="VerbatimChar"/>
+        </w:rPr>
+        <w:t xml:space="preserve">.github/workflows/ci.yml</w:t>
+      </w:r>
+      <w:r>
+        <w:t xml:space="preserve"> </w:t>
+      </w:r>
+      <w:r>
+        <w:t xml:space="preserve">runs backend unit tests, the shipped</w:t>
+      </w:r>
+      <w:r>
+        <w:t xml:space="preserve"> </w:t>
+      </w:r>
+      <w:r>
+        <w:t xml:space="preserve">frontend build, and the e2e journey on every push and PR.</w:t>
+      </w:r>
+      <w:r>
+        <w:t xml:space="preserve"> </w:t>
+      </w:r>
+      <w:r>
+        <w:rPr>
+          <w:b/>
+          <w:bCs/>
+        </w:rPr>
+        <w:t xml:space="preserve">A red PR does not merge.</w:t>
       </w:r>
     </w:p>
     <w:p>
@@ -3508,19 +3754,7 @@
         <w:t xml:space="preserve"> </w:t>
       </w:r>
       <w:r>
-        <w:t xml:space="preserve">Subject ≤ 50 chars, imperative mood. Body only when the</w:t>
-      </w:r>
-      <w:r>
-        <w:t xml:space="preserve"> </w:t>
-      </w:r>
-      <w:r>
-        <w:t xml:space="preserve">“why”</w:t>
-      </w:r>
-      <w:r>
-        <w:t xml:space="preserve"> </w:t>
-      </w:r>
-      <w:r>
-        <w:t xml:space="preserve">isn’t obvious.</w:t>
+        <w:t xml:space="preserve">Subject ≤ 50 chars, imperative mood. Body only when the "why" isn't obvious.</w:t>
       </w:r>
     </w:p>
     <w:p>
@@ -3674,6 +3908,15 @@
         <w:rPr>
           <w:rStyle w:val="VerbatimChar"/>
         </w:rPr>
+        <w:t xml:space="preserve">- [ ] CI green (all three jobs)</w:t>
+      </w:r>
+      <w:r>
+        <w:br/>
+      </w:r>
+      <w:r>
+        <w:rPr>
+          <w:rStyle w:val="VerbatimChar"/>
+        </w:rPr>
         <w:t xml:space="preserve">- [ ] Manually verified in the running app</w:t>
       </w:r>
       <w:r>
@@ -3702,8 +3945,8 @@
         </w:pict>
       </w:r>
     </w:p>
-    <w:bookmarkEnd w:id="28"/>
-    <w:bookmarkStart w:id="29" w:name="docker-local-dev"/>
+    <w:bookmarkEnd w:id="17"/>
+    <w:bookmarkStart w:id="18" w:name="X948b14f5d635917c9d0c9d4007cb09919744697"/>
     <w:p>
       <w:pPr>
         <w:pStyle w:val="Heading1"/>
@@ -3800,7 +4043,7 @@
         <w:t xml:space="preserve">docker compose up</w:t>
       </w:r>
       <w:r>
-        <w:t xml:space="preserve">, it’s not done.</w:t>
+        <w:t xml:space="preserve">, it's not done.</w:t>
       </w:r>
     </w:p>
     <w:p>
@@ -3882,13 +4125,98 @@
           <w:b/>
           <w:bCs/>
         </w:rPr>
-        <w:t xml:space="preserve">Destroy the container after each run</w:t>
-      </w:r>
-      <w:r>
-        <w:t xml:space="preserve"> </w:t>
-      </w:r>
-      <w:r>
-        <w:t xml:space="preserve">— no reuse, no state leaking between submissions.</w:t>
+        <w:t xml:space="preserve">Destroy the container after each submission</w:t>
+      </w:r>
+      <w:r>
+        <w:t xml:space="preserve"> </w:t>
+      </w:r>
+      <w:r>
+        <w:t xml:space="preserve">— no state leaks between submissions. Note the</w:t>
+      </w:r>
+      <w:r>
+        <w:t xml:space="preserve"> </w:t>
+      </w:r>
+      <w:r>
+        <w:t xml:space="preserve">unit: since</w:t>
+      </w:r>
+      <w:r>
+        <w:t xml:space="preserve"> </w:t>
+      </w:r>
+      <w:r>
+        <w:rPr>
+          <w:rStyle w:val="VerbatimChar"/>
+        </w:rPr>
+        <w:t xml:space="preserve">#51</w:t>
+      </w:r>
+      <w:r>
+        <w:t xml:space="preserve"> </w:t>
+      </w:r>
+      <w:r>
+        <w:t xml:space="preserve">the judge stands up</w:t>
+      </w:r>
+      <w:r>
+        <w:t xml:space="preserve"> </w:t>
+      </w:r>
+      <w:r>
+        <w:rPr>
+          <w:b/>
+          <w:bCs/>
+        </w:rPr>
+        <w:t xml:space="preserve">one container per submission</w:t>
+      </w:r>
+      <w:r>
+        <w:t xml:space="preserve"> </w:t>
+      </w:r>
+      <w:r>
+        <w:t xml:space="preserve">and runs each test case as</w:t>
+      </w:r>
+      <w:r>
+        <w:t xml:space="preserve"> </w:t>
+      </w:r>
+      <w:r>
+        <w:t xml:space="preserve">a</w:t>
+      </w:r>
+      <w:r>
+        <w:t xml:space="preserve"> </w:t>
+      </w:r>
+      <w:r>
+        <w:rPr>
+          <w:rStyle w:val="VerbatimChar"/>
+        </w:rPr>
+        <w:t xml:space="preserve">docker exec</w:t>
+      </w:r>
+      <w:r>
+        <w:t xml:space="preserve"> </w:t>
+      </w:r>
+      <w:r>
+        <w:t xml:space="preserve">into it, rather than one container per case; that is where its ~4× speedup comes</w:t>
+      </w:r>
+      <w:r>
+        <w:t xml:space="preserve"> </w:t>
+      </w:r>
+      <w:r>
+        <w:t xml:space="preserve">from. Cases within a single submission therefore share a container, which is a submission's own</w:t>
+      </w:r>
+      <w:r>
+        <w:t xml:space="preserve"> </w:t>
+      </w:r>
+      <w:r>
+        <w:t xml:space="preserve">code either way. Set</w:t>
+      </w:r>
+      <w:r>
+        <w:t xml:space="preserve"> </w:t>
+      </w:r>
+      <w:r>
+        <w:rPr>
+          <w:rStyle w:val="VerbatimChar"/>
+        </w:rPr>
+        <w:t xml:space="preserve">SANDBOX_REUSE_CONTAINER=false</w:t>
+      </w:r>
+      <w:r>
+        <w:t xml:space="preserve"> </w:t>
+      </w:r>
+      <w:r>
+        <w:t xml:space="preserve">to fall back to one container per case.</w:t>
       </w:r>
     </w:p>
     <w:p>
@@ -4014,8 +4342,8 @@
         </w:pict>
       </w:r>
     </w:p>
-    <w:bookmarkEnd w:id="29"/>
-    <w:bookmarkStart w:id="30" w:name="testing-definition-of-done"/>
+    <w:bookmarkEnd w:id="18"/>
+    <w:bookmarkStart w:id="19" w:name="Xc6085f7020b21f4e98b76146c5f42c16d528a0c"/>
     <w:p>
       <w:pPr>
         <w:pStyle w:val="Heading1"/>
@@ -4107,7 +4435,164 @@
         <w:t xml:space="preserve"> </w:t>
       </w:r>
       <w:r>
-        <w:t xml:space="preserve">solutions per seeded problem; run them every sprint as a smoke test so a refactor can’t silently break verdicts.</w:t>
+        <w:t xml:space="preserve">solutions per seeded</w:t>
+      </w:r>
+      <w:r>
+        <w:t xml:space="preserve"> </w:t>
+      </w:r>
+      <w:r>
+        <w:t xml:space="preserve">problem; run them every sprint as a smoke test so a refactor can't silently break verdicts.</w:t>
+      </w:r>
+      <w:r>
+        <w:t xml:space="preserve"> </w:t>
+      </w:r>
+      <w:r>
+        <w:rPr>
+          <w:b/>
+          <w:bCs/>
+        </w:rPr>
+        <w:t xml:space="preserve">The AC half of this exists</w:t>
+      </w:r>
+      <w:r>
+        <w:t xml:space="preserve">:</w:t>
+      </w:r>
+      <w:r>
+        <w:t xml:space="preserve"> </w:t>
+      </w:r>
+      <w:r>
+        <w:rPr>
+          <w:rStyle w:val="VerbatimChar"/>
+        </w:rPr>
+        <w:t xml:space="preserve">demo/solutions/&lt;problem-slug&gt;/{main.cpp,main.py,Main.java}</w:t>
+      </w:r>
+      <w:r>
+        <w:t xml:space="preserve"> </w:t>
+      </w:r>
+      <w:r>
+        <w:t xml:space="preserve">— one</w:t>
+      </w:r>
+      <w:r>
+        <w:t xml:space="preserve"> </w:t>
+      </w:r>
+      <w:r>
+        <w:t xml:space="preserve">accepted solution for every seeded problem in every language the judge offers — and</w:t>
+      </w:r>
+      <w:r>
+        <w:t xml:space="preserve"> </w:t>
+      </w:r>
+      <w:r>
+        <w:rPr>
+          <w:rStyle w:val="VerbatimChar"/>
+        </w:rPr>
+        <w:t xml:space="preserve">node demo/solutions/verify.mjs</w:t>
+      </w:r>
+      <w:r>
+        <w:t xml:space="preserve"> </w:t>
+      </w:r>
+      <w:r>
+        <w:t xml:space="preserve">submits all of them and asserts</w:t>
+      </w:r>
+      <w:r>
+        <w:t xml:space="preserve"> </w:t>
+      </w:r>
+      <w:r>
+        <w:rPr>
+          <w:rStyle w:val="VerbatimChar"/>
+        </w:rPr>
+        <w:t xml:space="preserve">AC</w:t>
+      </w:r>
+      <w:r>
+        <w:t xml:space="preserve">. The</w:t>
+      </w:r>
+      <w:r>
+        <w:t xml:space="preserve"> </w:t>
+      </w:r>
+      <w:r>
+        <w:rPr>
+          <w:b/>
+          <w:bCs/>
+        </w:rPr>
+        <w:t xml:space="preserve">WA/TLE/MLE/RE/CE</w:t>
+      </w:r>
+      <w:r>
+        <w:rPr>
+          <w:b/>
+          <w:bCs/>
+        </w:rPr>
+        <w:t xml:space="preserve"> </w:t>
+      </w:r>
+      <w:r>
+        <w:rPr>
+          <w:b/>
+          <w:bCs/>
+        </w:rPr>
+        <w:t xml:space="preserve">half does not exist yet</w:t>
+      </w:r>
+      <w:r>
+        <w:t xml:space="preserve">; those verdicts are still produced by typing wrong code by hand. The</w:t>
+      </w:r>
+      <w:r>
+        <w:t xml:space="preserve"> </w:t>
+      </w:r>
+      <w:r>
+        <w:t xml:space="preserve">filenames are fixed by</w:t>
+      </w:r>
+      <w:r>
+        <w:t xml:space="preserve"> </w:t>
+      </w:r>
+      <w:r>
+        <w:rPr>
+          <w:rStyle w:val="VerbatimChar"/>
+        </w:rPr>
+        <w:t xml:space="preserve">submission/engine/Language.java</w:t>
+      </w:r>
+      <w:r>
+        <w:t xml:space="preserve"> </w:t>
+      </w:r>
+      <w:r>
+        <w:t xml:space="preserve">(</w:t>
+      </w:r>
+      <w:r>
+        <w:rPr>
+          <w:rStyle w:val="VerbatimChar"/>
+        </w:rPr>
+        <w:t xml:space="preserve">Main.java</w:t>
+      </w:r>
+      <w:r>
+        <w:t xml:space="preserve"> </w:t>
+      </w:r>
+      <w:r>
+        <w:t xml:space="preserve">must hold</w:t>
+      </w:r>
+      <w:r>
+        <w:t xml:space="preserve"> </w:t>
+      </w:r>
+      <w:r>
+        <w:rPr>
+          <w:rStyle w:val="VerbatimChar"/>
+        </w:rPr>
+        <w:t xml:space="preserve">public class Main</w:t>
+      </w:r>
+      <w:r>
+        <w:t xml:space="preserve"> </w:t>
+      </w:r>
+      <w:r>
+        <w:t xml:space="preserve">or</w:t>
+      </w:r>
+      <w:r>
+        <w:t xml:space="preserve"> </w:t>
+      </w:r>
+      <w:r>
+        <w:rPr>
+          <w:rStyle w:val="VerbatimChar"/>
+        </w:rPr>
+        <w:t xml:space="preserve">javac</w:t>
+      </w:r>
+      <w:r>
+        <w:t xml:space="preserve"> </w:t>
+      </w:r>
+      <w:r>
+        <w:t xml:space="preserve">gives an honest CE) — don't rename them.</w:t>
       </w:r>
     </w:p>
     <w:p>
@@ -4123,13 +4608,85 @@
           <w:b/>
           <w:bCs/>
         </w:rPr>
-        <w:t xml:space="preserve">Frontend:</w:t>
-      </w:r>
-      <w:r>
-        <w:t xml:space="preserve"> </w:t>
-      </w:r>
-      <w:r>
-        <w:t xml:space="preserve">component tests for the submit + standings flows.</w:t>
+        <w:t xml:space="preserve">Frontend: there is no test runner in v1 — state it plainly rather than pretend.</w:t>
+      </w:r>
+      <w:r>
+        <w:t xml:space="preserve"> </w:t>
+      </w:r>
+      <w:r>
+        <w:t xml:space="preserve">No</w:t>
+      </w:r>
+      <w:r>
+        <w:t xml:space="preserve"> </w:t>
+      </w:r>
+      <w:r>
+        <w:rPr>
+          <w:rStyle w:val="VerbatimChar"/>
+        </w:rPr>
+        <w:t xml:space="preserve">.spec.ts</w:t>
+      </w:r>
+      <w:r>
+        <w:t xml:space="preserve">, no karma/jest/vitest, no</w:t>
+      </w:r>
+      <w:r>
+        <w:t xml:space="preserve"> </w:t>
+      </w:r>
+      <w:r>
+        <w:rPr>
+          <w:rStyle w:val="VerbatimChar"/>
+        </w:rPr>
+        <w:t xml:space="preserve">npm test</w:t>
+      </w:r>
+      <w:r>
+        <w:t xml:space="preserve">. What stands in for it: the</w:t>
+      </w:r>
+      <w:r>
+        <w:t xml:space="preserve"> </w:t>
+      </w:r>
+      <w:r>
+        <w:rPr>
+          <w:b/>
+          <w:bCs/>
+        </w:rPr>
+        <w:t xml:space="preserve">e2e journey</w:t>
+      </w:r>
+      <w:r>
+        <w:t xml:space="preserve"> </w:t>
+      </w:r>
+      <w:r>
+        <w:t xml:space="preserve">(</w:t>
+      </w:r>
+      <w:r>
+        <w:rPr>
+          <w:rStyle w:val="VerbatimChar"/>
+        </w:rPr>
+        <w:t xml:space="preserve">scripts/e2e.mjs</w:t>
+      </w:r>
+      <w:r>
+        <w:t xml:space="preserve">, run in CI) exercises submit and standings against the real stack, and</w:t>
+      </w:r>
+      <w:r>
+        <w:t xml:space="preserve"> </w:t>
+      </w:r>
+      <w:r>
+        <w:rPr>
+          <w:rStyle w:val="VerbatimChar"/>
+          <w:b/>
+          <w:bCs/>
+        </w:rPr>
+        <w:t xml:space="preserve">scripts/check-mark-dirty.mjs</w:t>
+      </w:r>
+      <w:r>
+        <w:t xml:space="preserve"> </w:t>
+      </w:r>
+      <w:r>
+        <w:t xml:space="preserve">guards the one convention a compiler cannot (§4.3). Adding a</w:t>
+      </w:r>
+      <w:r>
+        <w:t xml:space="preserve"> </w:t>
+      </w:r>
+      <w:r>
+        <w:t xml:space="preserve">runner is a v2 item; until then do not write a DoD checkbox that no one can tick.</w:t>
       </w:r>
     </w:p>
     <w:p>
@@ -4232,7 +4789,17 @@
         </w:numPr>
       </w:pPr>
       <w:r>
-        <w:t xml:space="preserve">Endpoint matches the API contract.</w:t>
+        <w:rPr>
+          <w:b/>
+          <w:bCs/>
+        </w:rPr>
+        <w:t xml:space="preserve">CI green on all three jobs</w:t>
+      </w:r>
+      <w:r>
+        <w:t xml:space="preserve"> </w:t>
+      </w:r>
+      <w:r>
+        <w:t xml:space="preserve">— unit tests, frontend build, e2e journey.</w:t>
       </w:r>
     </w:p>
     <w:p>
@@ -4244,7 +4811,7 @@
         </w:numPr>
       </w:pPr>
       <w:r>
-        <w:t xml:space="preserve">Manually verified in the running app.</w:t>
+        <w:t xml:space="preserve">Endpoint matches the API contract.</w:t>
       </w:r>
     </w:p>
     <w:p>
@@ -4256,6 +4823,18 @@
         </w:numPr>
       </w:pPr>
       <w:r>
+        <w:t xml:space="preserve">Manually verified in the running app.</w:t>
+      </w:r>
+    </w:p>
+    <w:p>
+      <w:pPr>
+        <w:pStyle w:val="Compact"/>
+        <w:numPr>
+          <w:ilvl w:val="0"/>
+          <w:numId w:val="1013"/>
+        </w:numPr>
+      </w:pPr>
+      <w:r>
         <w:t xml:space="preserve">No console / stack-trace errors.</w:t>
       </w:r>
     </w:p>
@@ -4266,14 +4845,47 @@
         </w:pict>
       </w:r>
     </w:p>
-    <w:bookmarkEnd w:id="30"/>
-    <w:bookmarkStart w:id="31" w:name="cheat-sheet"/>
+    <w:bookmarkEnd w:id="19"/>
+    <w:bookmarkStart w:id="20" w:name="Xd823b78e5b361b345122cd51aaf2adc0fe5079c"/>
     <w:p>
       <w:pPr>
         <w:pStyle w:val="Heading1"/>
       </w:pPr>
       <w:r>
-        <w:t xml:space="preserve">9. Cheat sheet</w:t>
+        <w:t xml:space="preserve">8b. Pull request scope &amp; hygiene</w:t>
+      </w:r>
+    </w:p>
+    <w:p>
+      <w:pPr>
+        <w:pStyle w:val="FirstParagraph"/>
+      </w:pPr>
+      <w:r>
+        <w:t xml:space="preserve">Every PR is reviewed by the integrator before it merges to</w:t>
+      </w:r>
+      <w:r>
+        <w:t xml:space="preserve"> </w:t>
+      </w:r>
+      <w:r>
+        <w:rPr>
+          <w:rStyle w:val="VerbatimChar"/>
+        </w:rPr>
+        <w:t xml:space="preserve">main</w:t>
+      </w:r>
+      <w:r>
+        <w:t xml:space="preserve">. To keep reviews fast and reverts painless, a PR must stay</w:t>
+      </w:r>
+      <w:r>
+        <w:t xml:space="preserve"> </w:t>
+      </w:r>
+      <w:r>
+        <w:rPr>
+          <w:b/>
+          <w:bCs/>
+        </w:rPr>
+        <w:t xml:space="preserve">inside its own lane</w:t>
+      </w:r>
+      <w:r>
+        <w:t xml:space="preserve">:</w:t>
       </w:r>
     </w:p>
     <w:p>
@@ -4289,83 +4901,70 @@
           <w:b/>
           <w:bCs/>
         </w:rPr>
-        <w:t xml:space="preserve">DB</w:t>
-      </w:r>
-      <w:r>
-        <w:t xml:space="preserve"> </w:t>
-      </w:r>
-      <w:r>
-        <w:rPr>
-          <w:rStyle w:val="VerbatimChar"/>
-        </w:rPr>
-        <w:t xml:space="preserve">snake_case</w:t>
-      </w:r>
-      <w:r>
-        <w:t xml:space="preserve">, plural tables,</w:t>
-      </w:r>
-      <w:r>
-        <w:t xml:space="preserve"> </w:t>
-      </w:r>
-      <w:r>
-        <w:rPr>
-          <w:rStyle w:val="VerbatimChar"/>
-        </w:rPr>
-        <w:t xml:space="preserve">id</w:t>
-      </w:r>
-      <w:r>
-        <w:t xml:space="preserve"> </w:t>
-      </w:r>
-      <w:r>
-        <w:t xml:space="preserve">PK,</w:t>
-      </w:r>
-      <w:r>
-        <w:t xml:space="preserve"> </w:t>
-      </w:r>
-      <w:r>
-        <w:rPr>
-          <w:rStyle w:val="VerbatimChar"/>
-        </w:rPr>
-        <w:t xml:space="preserve">&lt;entity&gt;_id</w:t>
-      </w:r>
-      <w:r>
-        <w:t xml:space="preserve"> </w:t>
-      </w:r>
-      <w:r>
-        <w:t xml:space="preserve">FK ·</w:t>
-      </w:r>
-      <w:r>
-        <w:t xml:space="preserve"> </w:t>
-      </w:r>
-      <w:r>
-        <w:rPr>
-          <w:b/>
-          <w:bCs/>
-        </w:rPr>
-        <w:t xml:space="preserve">JSON</w:t>
-      </w:r>
-      <w:r>
-        <w:t xml:space="preserve"> </w:t>
-      </w:r>
-      <w:r>
-        <w:rPr>
-          <w:rStyle w:val="VerbatimChar"/>
-        </w:rPr>
-        <w:t xml:space="preserve">camelCase</w:t>
-      </w:r>
-      <w:r>
-        <w:t xml:space="preserve">, enums</w:t>
-      </w:r>
-      <w:r>
-        <w:t xml:space="preserve"> </w:t>
-      </w:r>
-      <w:r>
-        <w:rPr>
-          <w:rStyle w:val="VerbatimChar"/>
-        </w:rPr>
-        <w:t xml:space="preserve">UPPERCASE</w:t>
-      </w:r>
-      <w:r>
-        <w:t xml:space="preserve">.</w:t>
+        <w:t xml:space="preserve">Touch only your package.</w:t>
+      </w:r>
+      <w:r>
+        <w:t xml:space="preserve"> </w:t>
+      </w:r>
+      <w:r>
+        <w:t xml:space="preserve">A PR changes files in the module you own (</w:t>
+      </w:r>
+      <w:r>
+        <w:rPr>
+          <w:rStyle w:val="VerbatimChar"/>
+        </w:rPr>
+        <w:t xml:space="preserve">identity/</w:t>
+      </w:r>
+      <w:r>
+        <w:t xml:space="preserve">,</w:t>
+      </w:r>
+      <w:r>
+        <w:t xml:space="preserve"> </w:t>
+      </w:r>
+      <w:r>
+        <w:rPr>
+          <w:rStyle w:val="VerbatimChar"/>
+        </w:rPr>
+        <w:t xml:space="preserve">problem/</w:t>
+      </w:r>
+      <w:r>
+        <w:t xml:space="preserve">,</w:t>
+      </w:r>
+      <w:r>
+        <w:t xml:space="preserve"> </w:t>
+      </w:r>
+      <w:r>
+        <w:rPr>
+          <w:rStyle w:val="VerbatimChar"/>
+        </w:rPr>
+        <w:t xml:space="preserve">submission/</w:t>
+      </w:r>
+      <w:r>
+        <w:t xml:space="preserve">,</w:t>
+      </w:r>
+      <w:r>
+        <w:t xml:space="preserve"> </w:t>
+      </w:r>
+      <w:r>
+        <w:rPr>
+          <w:rStyle w:val="VerbatimChar"/>
+        </w:rPr>
+        <w:t xml:space="preserve">contest/</w:t>
+      </w:r>
+      <w:r>
+        <w:t xml:space="preserve">,</w:t>
+      </w:r>
+      <w:r>
+        <w:t xml:space="preserve"> </w:t>
+      </w:r>
+      <w:r>
+        <w:rPr>
+          <w:rStyle w:val="VerbatimChar"/>
+        </w:rPr>
+        <w:t xml:space="preserve">ws/</w:t>
+      </w:r>
+      <w:r>
+        <w:t xml:space="preserve">, or your Angular slice). If you think you need to change someone else's file, ask first — usually the real fix is a service bean or a contract change, not editing their code.</w:t>
       </w:r>
     </w:p>
     <w:p>
@@ -4381,37 +4980,64 @@
           <w:b/>
           <w:bCs/>
         </w:rPr>
-        <w:t xml:space="preserve">Java</w:t>
-      </w:r>
-      <w:r>
-        <w:t xml:space="preserve"> </w:t>
-      </w:r>
-      <w:r>
-        <w:rPr>
-          <w:rStyle w:val="VerbatimChar"/>
-        </w:rPr>
-        <w:t xml:space="preserve">PascalCase</w:t>
-      </w:r>
-      <w:r>
-        <w:t xml:space="preserve"> </w:t>
-      </w:r>
-      <w:r>
-        <w:t xml:space="preserve">classes with</w:t>
-      </w:r>
-      <w:r>
-        <w:t xml:space="preserve"> </w:t>
-      </w:r>
-      <w:r>
-        <w:rPr>
-          <w:rStyle w:val="VerbatimChar"/>
-        </w:rPr>
-        <w:t xml:space="preserve">Controller/Service/Repository</w:t>
-      </w:r>
-      <w:r>
-        <w:t xml:space="preserve"> </w:t>
-      </w:r>
-      <w:r>
-        <w:t xml:space="preserve">suffix · constructor injection · DTOs at the boundary, never raw entities.</w:t>
+        <w:t xml:space="preserve">Nothing at the repo root.</w:t>
+      </w:r>
+      <w:r>
+        <w:t xml:space="preserve"> </w:t>
+      </w:r>
+      <w:r>
+        <w:t xml:space="preserve">The Angular app lives under</w:t>
+      </w:r>
+      <w:r>
+        <w:t xml:space="preserve"> </w:t>
+      </w:r>
+      <w:r>
+        <w:rPr>
+          <w:rStyle w:val="VerbatimChar"/>
+        </w:rPr>
+        <w:t xml:space="preserve">frontend/</w:t>
+      </w:r>
+      <w:r>
+        <w:t xml:space="preserve">. Loose</w:t>
+      </w:r>
+      <w:r>
+        <w:t xml:space="preserve"> </w:t>
+      </w:r>
+      <w:r>
+        <w:rPr>
+          <w:rStyle w:val="VerbatimChar"/>
+        </w:rPr>
+        <w:t xml:space="preserve">.html</w:t>
+      </w:r>
+      <w:r>
+        <w:t xml:space="preserve">,</w:t>
+      </w:r>
+      <w:r>
+        <w:t xml:space="preserve"> </w:t>
+      </w:r>
+      <w:r>
+        <w:rPr>
+          <w:rStyle w:val="VerbatimChar"/>
+        </w:rPr>
+        <w:t xml:space="preserve">.css</w:t>
+      </w:r>
+      <w:r>
+        <w:t xml:space="preserve">, or</w:t>
+      </w:r>
+      <w:r>
+        <w:t xml:space="preserve"> </w:t>
+      </w:r>
+      <w:r>
+        <w:rPr>
+          <w:rStyle w:val="VerbatimChar"/>
+        </w:rPr>
+        <w:t xml:space="preserve">.md</w:t>
+      </w:r>
+      <w:r>
+        <w:t xml:space="preserve"> </w:t>
+      </w:r>
+      <w:r>
+        <w:t xml:space="preserve">files at the top level do not belong in the repo and are git-ignored — if a prototype or mockup helped you, keep it outside the repo.</w:t>
       </w:r>
     </w:p>
     <w:p>
@@ -4427,37 +5053,40 @@
           <w:b/>
           <w:bCs/>
         </w:rPr>
-        <w:t xml:space="preserve">MVC</w:t>
-      </w:r>
-      <w:r>
-        <w:t xml:space="preserve"> </w:t>
-      </w:r>
-      <w:r>
-        <w:t xml:space="preserve">Model = JPA entities + repositories + services · View = Angular SPA + JSON · Controller = thin</w:t>
-      </w:r>
-      <w:r>
-        <w:t xml:space="preserve"> </w:t>
-      </w:r>
-      <w:r>
-        <w:rPr>
-          <w:rStyle w:val="VerbatimChar"/>
-        </w:rPr>
-        <w:t xml:space="preserve">@RestController</w:t>
-      </w:r>
-      <w:r>
-        <w:t xml:space="preserve">. Within the Model tier layer</w:t>
-      </w:r>
-      <w:r>
-        <w:t xml:space="preserve"> </w:t>
-      </w:r>
-      <w:r>
-        <w:rPr>
-          <w:rStyle w:val="VerbatimChar"/>
-        </w:rPr>
-        <w:t xml:space="preserve">Service → Repository</w:t>
-      </w:r>
-      <w:r>
-        <w:t xml:space="preserve">; no logic in controllers, no queries outside repositories.</w:t>
+        <w:t xml:space="preserve">No private / internal docs.</w:t>
+      </w:r>
+      <w:r>
+        <w:t xml:space="preserve"> </w:t>
+      </w:r>
+      <w:r>
+        <w:t xml:space="preserve">Onboarding, working manual, journal, trackers, SRS,</w:t>
+      </w:r>
+      <w:r>
+        <w:t xml:space="preserve"> </w:t>
+      </w:r>
+      <w:r>
+        <w:rPr>
+          <w:rStyle w:val="VerbatimChar"/>
+        </w:rPr>
+        <w:t xml:space="preserve">.xlsx</w:t>
+      </w:r>
+      <w:r>
+        <w:t xml:space="preserve">,</w:t>
+      </w:r>
+      <w:r>
+        <w:t xml:space="preserve"> </w:t>
+      </w:r>
+      <w:r>
+        <w:rPr>
+          <w:rStyle w:val="VerbatimChar"/>
+        </w:rPr>
+        <w:t xml:space="preserve">.env</w:t>
+      </w:r>
+      <w:r>
+        <w:t xml:space="preserve"> </w:t>
+      </w:r>
+      <w:r>
+        <w:t xml:space="preserve">— none of these are ever committed. They are shared separately.</w:t>
       </w:r>
     </w:p>
     <w:p>
@@ -4473,61 +5102,31 @@
           <w:b/>
           <w:bCs/>
         </w:rPr>
-        <w:t xml:space="preserve">API</w:t>
-      </w:r>
-      <w:r>
-        <w:t xml:space="preserve"> </w:t>
-      </w:r>
-      <w:r>
-        <w:t xml:space="preserve">shapes are fixed in</w:t>
-      </w:r>
-      <w:r>
-        <w:t xml:space="preserve"> </w:t>
-      </w:r>
-      <w:r>
-        <w:rPr>
-          <w:rStyle w:val="VerbatimChar"/>
-        </w:rPr>
-        <w:t xml:space="preserve">api-contracts.md</w:t>
-      </w:r>
-      <w:r>
-        <w:t xml:space="preserve">. Base</w:t>
-      </w:r>
-      <w:r>
-        <w:t xml:space="preserve"> </w:t>
-      </w:r>
-      <w:r>
-        <w:rPr>
-          <w:rStyle w:val="VerbatimChar"/>
-        </w:rPr>
-        <w:t xml:space="preserve">/api</w:t>
-      </w:r>
-      <w:r>
-        <w:t xml:space="preserve">, Bearer JWT, ISO-8601 UTC, error</w:t>
-      </w:r>
-      <w:r>
-        <w:t xml:space="preserve"> </w:t>
-      </w:r>
-      <w:r>
-        <w:rPr>
-          <w:rStyle w:val="VerbatimChar"/>
-        </w:rPr>
-        <w:t xml:space="preserve">{error,status}</w:t>
-      </w:r>
-      <w:r>
-        <w:t xml:space="preserve">, pages</w:t>
-      </w:r>
-      <w:r>
-        <w:t xml:space="preserve"> </w:t>
-      </w:r>
-      <w:r>
-        <w:rPr>
-          <w:rStyle w:val="VerbatimChar"/>
-        </w:rPr>
-        <w:t xml:space="preserve">{content,page,size,totalElements}</w:t>
-      </w:r>
-      <w:r>
-        <w:t xml:space="preserve">.</w:t>
+        <w:t xml:space="preserve">Shared files are additive-only.</w:t>
+      </w:r>
+      <w:r>
+        <w:t xml:space="preserve"> </w:t>
+      </w:r>
+      <w:r>
+        <w:rPr>
+          <w:rStyle w:val="VerbatimChar"/>
+        </w:rPr>
+        <w:t xml:space="preserve">styles.scss</w:t>
+      </w:r>
+      <w:r>
+        <w:t xml:space="preserve">,</w:t>
+      </w:r>
+      <w:r>
+        <w:t xml:space="preserve"> </w:t>
+      </w:r>
+      <w:r>
+        <w:rPr>
+          <w:rStyle w:val="VerbatimChar"/>
+        </w:rPr>
+        <w:t xml:space="preserve">app.routes.ts</w:t>
+      </w:r>
+      <w:r>
+        <w:t xml:space="preserve">, and other shared files: add your lines, never rewrite the file. A wholesale rewrite clobbers everyone else's work and blocks the merge.</w:t>
       </w:r>
     </w:p>
     <w:p>
@@ -4543,13 +5142,47 @@
           <w:b/>
           <w:bCs/>
         </w:rPr>
-        <w:t xml:space="preserve">Integration</w:t>
-      </w:r>
-      <w:r>
-        <w:t xml:space="preserve"> </w:t>
-      </w:r>
-      <w:r>
-        <w:t xml:space="preserve">engine reads DB directly · cross-module = service beans, never HTTP · validate role server-side on every write.</w:t>
+        <w:t xml:space="preserve">One concern per PR.</w:t>
+      </w:r>
+      <w:r>
+        <w:t xml:space="preserve"> </w:t>
+      </w:r>
+      <w:r>
+        <w:t xml:space="preserve">A single feature or fix. A 20-file PR mixing four features is unreviewable and gets sent back — split it.</w:t>
+      </w:r>
+    </w:p>
+    <w:p>
+      <w:pPr>
+        <w:pStyle w:val="FirstParagraph"/>
+      </w:pPr>
+      <w:r>
+        <w:t xml:space="preserve">The PR template (</w:t>
+      </w:r>
+      <w:r>
+        <w:rPr>
+          <w:rStyle w:val="VerbatimChar"/>
+        </w:rPr>
+        <w:t xml:space="preserve">.github/pull_request_template.md</w:t>
+      </w:r>
+      <w:r>
+        <w:t xml:space="preserve">) is this list as a checklist. Tick every box before requesting review.</w:t>
+      </w:r>
+    </w:p>
+    <w:p>
+      <w:r>
+        <w:pict>
+          <v:rect style="width:0;height:1.5pt" o:hralign="center" o:hrstd="t" o:hr="t"/>
+        </w:pict>
+      </w:r>
+    </w:p>
+    <w:bookmarkEnd w:id="20"/>
+    <w:bookmarkStart w:id="21" w:name="X02f35e3525ac7a7fd31e61602fc0f264685cdf5"/>
+    <w:p>
+      <w:pPr>
+        <w:pStyle w:val="Heading1"/>
+      </w:pPr>
+      <w:r>
+        <w:t xml:space="preserve">9. Cheat sheet</w:t>
       </w:r>
     </w:p>
     <w:p>
@@ -4557,7 +5190,7 @@
         <w:pStyle w:val="Compact"/>
         <w:numPr>
           <w:ilvl w:val="0"/>
-          <w:numId w:val="1014"/>
+          <w:numId w:val="1015"/>
         </w:numPr>
       </w:pPr>
       <w:r>
@@ -4565,58 +5198,83 @@
           <w:b/>
           <w:bCs/>
         </w:rPr>
-        <w:t xml:space="preserve">Git</w:t>
-      </w:r>
-      <w:r>
-        <w:t xml:space="preserve"> </w:t>
-      </w:r>
-      <w:r>
-        <w:t xml:space="preserve">branch</w:t>
-      </w:r>
-      <w:r>
-        <w:t xml:space="preserve"> </w:t>
-      </w:r>
-      <w:r>
-        <w:rPr>
-          <w:rStyle w:val="VerbatimChar"/>
-        </w:rPr>
-        <w:t xml:space="preserve">type/kebab-task</w:t>
-      </w:r>
-      <w:r>
-        <w:t xml:space="preserve"> </w:t>
-      </w:r>
-      <w:r>
-        <w:t xml:space="preserve">· never commit to</w:t>
-      </w:r>
-      <w:r>
-        <w:t xml:space="preserve"> </w:t>
-      </w:r>
-      <w:r>
-        <w:rPr>
-          <w:rStyle w:val="VerbatimChar"/>
-        </w:rPr>
-        <w:t xml:space="preserve">main</w:t>
-      </w:r>
-      <w:r>
-        <w:t xml:space="preserve"> </w:t>
-      </w:r>
-      <w:r>
-        <w:t xml:space="preserve">· PR reviewed by someone else · commit</w:t>
-      </w:r>
-      <w:r>
-        <w:t xml:space="preserve"> </w:t>
-      </w:r>
-      <w:r>
-        <w:rPr>
-          <w:rStyle w:val="VerbatimChar"/>
-        </w:rPr>
-        <w:t xml:space="preserve">type: summary</w:t>
-      </w:r>
-      <w:r>
-        <w:t xml:space="preserve"> </w:t>
-      </w:r>
-      <w:r>
-        <w:t xml:space="preserve">≤50 chars.</w:t>
+        <w:t xml:space="preserve">DB</w:t>
+      </w:r>
+      <w:r>
+        <w:t xml:space="preserve"> </w:t>
+      </w:r>
+      <w:r>
+        <w:rPr>
+          <w:rStyle w:val="VerbatimChar"/>
+        </w:rPr>
+        <w:t xml:space="preserve">snake_case</w:t>
+      </w:r>
+      <w:r>
+        <w:t xml:space="preserve">, plural tables,</w:t>
+      </w:r>
+      <w:r>
+        <w:t xml:space="preserve"> </w:t>
+      </w:r>
+      <w:r>
+        <w:rPr>
+          <w:rStyle w:val="VerbatimChar"/>
+        </w:rPr>
+        <w:t xml:space="preserve">id</w:t>
+      </w:r>
+      <w:r>
+        <w:t xml:space="preserve"> </w:t>
+      </w:r>
+      <w:r>
+        <w:t xml:space="preserve">PK,</w:t>
+      </w:r>
+      <w:r>
+        <w:t xml:space="preserve"> </w:t>
+      </w:r>
+      <w:r>
+        <w:rPr>
+          <w:rStyle w:val="VerbatimChar"/>
+        </w:rPr>
+        <w:t xml:space="preserve">&lt;entity&gt;_id</w:t>
+      </w:r>
+      <w:r>
+        <w:t xml:space="preserve"> </w:t>
+      </w:r>
+      <w:r>
+        <w:t xml:space="preserve">FK ·</w:t>
+      </w:r>
+      <w:r>
+        <w:t xml:space="preserve"> </w:t>
+      </w:r>
+      <w:r>
+        <w:rPr>
+          <w:b/>
+          <w:bCs/>
+        </w:rPr>
+        <w:t xml:space="preserve">JSON</w:t>
+      </w:r>
+      <w:r>
+        <w:t xml:space="preserve"> </w:t>
+      </w:r>
+      <w:r>
+        <w:rPr>
+          <w:rStyle w:val="VerbatimChar"/>
+        </w:rPr>
+        <w:t xml:space="preserve">camelCase</w:t>
+      </w:r>
+      <w:r>
+        <w:t xml:space="preserve">, enums</w:t>
+      </w:r>
+      <w:r>
+        <w:t xml:space="preserve"> </w:t>
+      </w:r>
+      <w:r>
+        <w:rPr>
+          <w:rStyle w:val="VerbatimChar"/>
+        </w:rPr>
+        <w:t xml:space="preserve">UPPERCASE</w:t>
+      </w:r>
+      <w:r>
+        <w:t xml:space="preserve">.</w:t>
       </w:r>
     </w:p>
     <w:p>
@@ -4624,7 +5282,7 @@
         <w:pStyle w:val="Compact"/>
         <w:numPr>
           <w:ilvl w:val="0"/>
-          <w:numId w:val="1014"/>
+          <w:numId w:val="1015"/>
         </w:numPr>
       </w:pPr>
       <w:r>
@@ -4632,37 +5290,37 @@
           <w:b/>
           <w:bCs/>
         </w:rPr>
-        <w:t xml:space="preserve">Docker</w:t>
-      </w:r>
-      <w:r>
-        <w:t xml:space="preserve"> </w:t>
-      </w:r>
-      <w:r>
-        <w:rPr>
-          <w:rStyle w:val="VerbatimChar"/>
-        </w:rPr>
-        <w:t xml:space="preserve">docker compose up</w:t>
-      </w:r>
-      <w:r>
-        <w:t xml:space="preserve"> </w:t>
-      </w:r>
-      <w:r>
-        <w:t xml:space="preserve">must stay green · sandbox = no network + hard limits + destroy after run · secrets via env,</w:t>
-      </w:r>
-      <w:r>
-        <w:t xml:space="preserve"> </w:t>
-      </w:r>
-      <w:r>
-        <w:rPr>
-          <w:rStyle w:val="VerbatimChar"/>
-        </w:rPr>
-        <w:t xml:space="preserve">.env</w:t>
-      </w:r>
-      <w:r>
-        <w:t xml:space="preserve"> </w:t>
-      </w:r>
-      <w:r>
-        <w:t xml:space="preserve">git-ignored.</w:t>
+        <w:t xml:space="preserve">Java</w:t>
+      </w:r>
+      <w:r>
+        <w:t xml:space="preserve"> </w:t>
+      </w:r>
+      <w:r>
+        <w:rPr>
+          <w:rStyle w:val="VerbatimChar"/>
+        </w:rPr>
+        <w:t xml:space="preserve">PascalCase</w:t>
+      </w:r>
+      <w:r>
+        <w:t xml:space="preserve"> </w:t>
+      </w:r>
+      <w:r>
+        <w:t xml:space="preserve">classes with</w:t>
+      </w:r>
+      <w:r>
+        <w:t xml:space="preserve"> </w:t>
+      </w:r>
+      <w:r>
+        <w:rPr>
+          <w:rStyle w:val="VerbatimChar"/>
+        </w:rPr>
+        <w:t xml:space="preserve">Controller/Service/Repository</w:t>
+      </w:r>
+      <w:r>
+        <w:t xml:space="preserve"> </w:t>
+      </w:r>
+      <w:r>
+        <w:t xml:space="preserve">suffix · constructor injection · DTOs at the boundary, never raw entities.</w:t>
       </w:r>
     </w:p>
     <w:p>
@@ -4670,7 +5328,7 @@
         <w:pStyle w:val="Compact"/>
         <w:numPr>
           <w:ilvl w:val="0"/>
-          <w:numId w:val="1014"/>
+          <w:numId w:val="1015"/>
         </w:numPr>
       </w:pPr>
       <w:r>
@@ -4678,16 +5336,428 @@
           <w:b/>
           <w:bCs/>
         </w:rPr>
+        <w:t xml:space="preserve">MVC</w:t>
+      </w:r>
+      <w:r>
+        <w:t xml:space="preserve"> </w:t>
+      </w:r>
+      <w:r>
+        <w:t xml:space="preserve">Model = JPA entities + repositories + services · View = Angular SPA + JSON · Controller = thin</w:t>
+      </w:r>
+      <w:r>
+        <w:t xml:space="preserve"> </w:t>
+      </w:r>
+      <w:r>
+        <w:rPr>
+          <w:rStyle w:val="VerbatimChar"/>
+        </w:rPr>
+        <w:t xml:space="preserve">@RestController</w:t>
+      </w:r>
+      <w:r>
+        <w:t xml:space="preserve">. Within the Model tier layer</w:t>
+      </w:r>
+      <w:r>
+        <w:t xml:space="preserve"> </w:t>
+      </w:r>
+      <w:r>
+        <w:rPr>
+          <w:rStyle w:val="VerbatimChar"/>
+        </w:rPr>
+        <w:t xml:space="preserve">Service → Repository</w:t>
+      </w:r>
+      <w:r>
+        <w:t xml:space="preserve">; no logic in controllers, no queries outside repositories.</w:t>
+      </w:r>
+    </w:p>
+    <w:p>
+      <w:pPr>
+        <w:pStyle w:val="Compact"/>
+        <w:numPr>
+          <w:ilvl w:val="0"/>
+          <w:numId w:val="1015"/>
+        </w:numPr>
+      </w:pPr>
+      <w:r>
+        <w:rPr>
+          <w:b/>
+          <w:bCs/>
+        </w:rPr>
+        <w:t xml:space="preserve">API</w:t>
+      </w:r>
+      <w:r>
+        <w:t xml:space="preserve"> </w:t>
+      </w:r>
+      <w:r>
+        <w:t xml:space="preserve">shapes are fixed in</w:t>
+      </w:r>
+      <w:r>
+        <w:t xml:space="preserve"> </w:t>
+      </w:r>
+      <w:r>
+        <w:rPr>
+          <w:rStyle w:val="VerbatimChar"/>
+        </w:rPr>
+        <w:t xml:space="preserve">api-contracts.md</w:t>
+      </w:r>
+      <w:r>
+        <w:t xml:space="preserve">. Base</w:t>
+      </w:r>
+      <w:r>
+        <w:t xml:space="preserve"> </w:t>
+      </w:r>
+      <w:r>
+        <w:rPr>
+          <w:rStyle w:val="VerbatimChar"/>
+        </w:rPr>
+        <w:t xml:space="preserve">/api</w:t>
+      </w:r>
+      <w:r>
+        <w:t xml:space="preserve">, Bearer JWT, ISO-8601 UTC, error</w:t>
+      </w:r>
+      <w:r>
+        <w:t xml:space="preserve"> </w:t>
+      </w:r>
+      <w:r>
+        <w:rPr>
+          <w:rStyle w:val="VerbatimChar"/>
+        </w:rPr>
+        <w:t xml:space="preserve">{error,status}</w:t>
+      </w:r>
+      <w:r>
+        <w:t xml:space="preserve">, pages</w:t>
+      </w:r>
+      <w:r>
+        <w:t xml:space="preserve"> </w:t>
+      </w:r>
+      <w:r>
+        <w:rPr>
+          <w:rStyle w:val="VerbatimChar"/>
+        </w:rPr>
+        <w:t xml:space="preserve">{content,page,size,totalElements}</w:t>
+      </w:r>
+      <w:r>
+        <w:t xml:space="preserve">.</w:t>
+      </w:r>
+    </w:p>
+    <w:p>
+      <w:pPr>
+        <w:pStyle w:val="Compact"/>
+        <w:numPr>
+          <w:ilvl w:val="0"/>
+          <w:numId w:val="1015"/>
+        </w:numPr>
+      </w:pPr>
+      <w:r>
+        <w:rPr>
+          <w:b/>
+          <w:bCs/>
+        </w:rPr>
+        <w:t xml:space="preserve">Integration</w:t>
+      </w:r>
+      <w:r>
+        <w:t xml:space="preserve"> </w:t>
+      </w:r>
+      <w:r>
+        <w:t xml:space="preserve">engine reads DB directly · cross-module = service beans, never HTTP · validate role server-side on every write.</w:t>
+      </w:r>
+    </w:p>
+    <w:p>
+      <w:pPr>
+        <w:pStyle w:val="Compact"/>
+        <w:numPr>
+          <w:ilvl w:val="0"/>
+          <w:numId w:val="1015"/>
+        </w:numPr>
+      </w:pPr>
+      <w:r>
+        <w:rPr>
+          <w:b/>
+          <w:bCs/>
+        </w:rPr>
+        <w:t xml:space="preserve">Git</w:t>
+      </w:r>
+      <w:r>
+        <w:t xml:space="preserve"> </w:t>
+      </w:r>
+      <w:r>
+        <w:t xml:space="preserve">branch</w:t>
+      </w:r>
+      <w:r>
+        <w:t xml:space="preserve"> </w:t>
+      </w:r>
+      <w:r>
+        <w:rPr>
+          <w:rStyle w:val="VerbatimChar"/>
+        </w:rPr>
+        <w:t xml:space="preserve">type/kebab-task</w:t>
+      </w:r>
+      <w:r>
+        <w:t xml:space="preserve"> </w:t>
+      </w:r>
+      <w:r>
+        <w:t xml:space="preserve">· never commit to</w:t>
+      </w:r>
+      <w:r>
+        <w:t xml:space="preserve"> </w:t>
+      </w:r>
+      <w:r>
+        <w:rPr>
+          <w:rStyle w:val="VerbatimChar"/>
+        </w:rPr>
+        <w:t xml:space="preserve">main</w:t>
+      </w:r>
+      <w:r>
+        <w:t xml:space="preserve"> </w:t>
+      </w:r>
+      <w:r>
+        <w:t xml:space="preserve">·</w:t>
+      </w:r>
+      <w:r>
+        <w:t xml:space="preserve"> </w:t>
+      </w:r>
+      <w:r>
+        <w:rPr>
+          <w:b/>
+          <w:bCs/>
+        </w:rPr>
+        <w:t xml:space="preserve">CI green (3 jobs) or it doesn't merge</w:t>
+      </w:r>
+      <w:r>
+        <w:t xml:space="preserve"> </w:t>
+      </w:r>
+      <w:r>
+        <w:t xml:space="preserve">· PR reviewed by someone else · commit</w:t>
+      </w:r>
+      <w:r>
+        <w:t xml:space="preserve"> </w:t>
+      </w:r>
+      <w:r>
+        <w:rPr>
+          <w:rStyle w:val="VerbatimChar"/>
+        </w:rPr>
+        <w:t xml:space="preserve">type: summary</w:t>
+      </w:r>
+      <w:r>
+        <w:t xml:space="preserve"> </w:t>
+      </w:r>
+      <w:r>
+        <w:t xml:space="preserve">≤50 chars.</w:t>
+      </w:r>
+    </w:p>
+    <w:p>
+      <w:pPr>
+        <w:pStyle w:val="Compact"/>
+        <w:numPr>
+          <w:ilvl w:val="0"/>
+          <w:numId w:val="1015"/>
+        </w:numPr>
+      </w:pPr>
+      <w:r>
+        <w:rPr>
+          <w:b/>
+          <w:bCs/>
+        </w:rPr>
+        <w:t xml:space="preserve">PR scope</w:t>
+      </w:r>
+      <w:r>
+        <w:t xml:space="preserve"> </w:t>
+      </w:r>
+      <w:r>
+        <w:t xml:space="preserve">only your package's files · nothing at repo root · no private docs /</w:t>
+      </w:r>
+      <w:r>
+        <w:t xml:space="preserve"> </w:t>
+      </w:r>
+      <w:r>
+        <w:rPr>
+          <w:rStyle w:val="VerbatimChar"/>
+        </w:rPr>
+        <w:t xml:space="preserve">.env</w:t>
+      </w:r>
+      <w:r>
+        <w:t xml:space="preserve"> </w:t>
+      </w:r>
+      <w:r>
+        <w:t xml:space="preserve">· shared files additive-only · one concern per PR.</w:t>
+      </w:r>
+    </w:p>
+    <w:p>
+      <w:pPr>
+        <w:pStyle w:val="Compact"/>
+        <w:numPr>
+          <w:ilvl w:val="0"/>
+          <w:numId w:val="1015"/>
+        </w:numPr>
+      </w:pPr>
+      <w:r>
+        <w:rPr>
+          <w:b/>
+          <w:bCs/>
+        </w:rPr>
+        <w:t xml:space="preserve">Docker</w:t>
+      </w:r>
+      <w:r>
+        <w:t xml:space="preserve"> </w:t>
+      </w:r>
+      <w:r>
+        <w:rPr>
+          <w:rStyle w:val="VerbatimChar"/>
+        </w:rPr>
+        <w:t xml:space="preserve">docker compose up</w:t>
+      </w:r>
+      <w:r>
+        <w:t xml:space="preserve"> </w:t>
+      </w:r>
+      <w:r>
+        <w:t xml:space="preserve">must stay green · sandbox = no network + hard limits +</w:t>
+      </w:r>
+      <w:r>
+        <w:t xml:space="preserve"> </w:t>
+      </w:r>
+      <w:r>
+        <w:rPr>
+          <w:b/>
+          <w:bCs/>
+        </w:rPr>
+        <w:t xml:space="preserve">one container per submission, destroyed after it</w:t>
+      </w:r>
+      <w:r>
+        <w:t xml:space="preserve"> </w:t>
+      </w:r>
+      <w:r>
+        <w:t xml:space="preserve">(</w:t>
+      </w:r>
+      <w:r>
+        <w:rPr>
+          <w:rStyle w:val="VerbatimChar"/>
+        </w:rPr>
+        <w:t xml:space="preserve">SANDBOX_REUSE_CONTAINER=false</w:t>
+      </w:r>
+      <w:r>
+        <w:t xml:space="preserve"> </w:t>
+      </w:r>
+      <w:r>
+        <w:t xml:space="preserve">for one per case) · secrets via env,</w:t>
+      </w:r>
+      <w:r>
+        <w:t xml:space="preserve"> </w:t>
+      </w:r>
+      <w:r>
+        <w:rPr>
+          <w:rStyle w:val="VerbatimChar"/>
+        </w:rPr>
+        <w:t xml:space="preserve">.env</w:t>
+      </w:r>
+      <w:r>
+        <w:t xml:space="preserve"> </w:t>
+      </w:r>
+      <w:r>
+        <w:t xml:space="preserve">git-ignored.</w:t>
+      </w:r>
+    </w:p>
+    <w:p>
+      <w:pPr>
+        <w:pStyle w:val="Compact"/>
+        <w:numPr>
+          <w:ilvl w:val="0"/>
+          <w:numId w:val="1015"/>
+        </w:numPr>
+      </w:pPr>
+      <w:r>
+        <w:rPr>
+          <w:b/>
+          <w:bCs/>
+        </w:rPr>
+        <w:t xml:space="preserve">Frontend</w:t>
+      </w:r>
+      <w:r>
+        <w:t xml:space="preserve"> </w:t>
+      </w:r>
+      <w:r>
+        <w:t xml:space="preserve">every component is OnPush ⇒ every</w:t>
+      </w:r>
+      <w:r>
+        <w:t xml:space="preserve"> </w:t>
+      </w:r>
+      <w:r>
+        <w:rPr>
+          <w:rStyle w:val="VerbatimChar"/>
+        </w:rPr>
+        <w:t xml:space="preserve">subscribe</w:t>
+      </w:r>
+      <w:r>
+        <w:t xml:space="preserve"> </w:t>
+      </w:r>
+      <w:r>
+        <w:t xml:space="preserve">pipes</w:t>
+      </w:r>
+      <w:r>
+        <w:t xml:space="preserve"> </w:t>
+      </w:r>
+      <w:r>
+        <w:rPr>
+          <w:rStyle w:val="VerbatimChar"/>
+        </w:rPr>
+        <w:t xml:space="preserve">markDirty(this.cdr)</w:t>
+      </w:r>
+      <w:r>
+        <w:t xml:space="preserve">; run</w:t>
+      </w:r>
+      <w:r>
+        <w:t xml:space="preserve"> </w:t>
+      </w:r>
+      <w:r>
+        <w:rPr>
+          <w:rStyle w:val="VerbatimChar"/>
+        </w:rPr>
+        <w:t xml:space="preserve">node scripts/check-mark-dirty.mjs</w:t>
+      </w:r>
+      <w:r>
+        <w:t xml:space="preserve"> </w:t>
+      </w:r>
+      <w:r>
+        <w:t xml:space="preserve">before a frontend PR. No unit-test runner in v1.</w:t>
+      </w:r>
+    </w:p>
+    <w:p>
+      <w:pPr>
+        <w:pStyle w:val="Compact"/>
+        <w:numPr>
+          <w:ilvl w:val="0"/>
+          <w:numId w:val="1015"/>
+        </w:numPr>
+      </w:pPr>
+      <w:r>
+        <w:rPr>
+          <w:b/>
+          <w:bCs/>
+        </w:rPr>
         <w:t xml:space="preserve">Done</w:t>
       </w:r>
       <w:r>
         <w:t xml:space="preserve"> </w:t>
       </w:r>
       <w:r>
-        <w:t xml:space="preserve">= merged + reviewed + tested + contract-matched + manually verified + no errors.</w:t>
-      </w:r>
-    </w:p>
-    <w:bookmarkEnd w:id="31"/>
+        <w:t xml:space="preserve">= merged + reviewed + tested +</w:t>
+      </w:r>
+      <w:r>
+        <w:t xml:space="preserve"> </w:t>
+      </w:r>
+      <w:r>
+        <w:rPr>
+          <w:b/>
+          <w:bCs/>
+        </w:rPr>
+        <w:t xml:space="preserve">CI green</w:t>
+      </w:r>
+      <w:r>
+        <w:t xml:space="preserve"> </w:t>
+      </w:r>
+      <w:r>
+        <w:t xml:space="preserve">+ contract-matched + manually verified + no errors.</w:t>
+      </w:r>
+    </w:p>
+    <w:bookmarkEnd w:id="21"/>
     <w:sectPr>
       <w:footnotePr>
         <w:numRestart w:val="eachSect"/>
@@ -5058,6 +6128,9 @@
   <w:num w:numId="1014">
     <w:abstractNumId w:val="991"/>
   </w:num>
+  <w:num w:numId="1015">
+    <w:abstractNumId w:val="991"/>
+  </w:num>
 </w:numbering>
 </file>
 
@@ -5066,10 +6139,10 @@
   <w:docDefaults>
     <w:rPrDefault>
       <w:rPr>
-        <w:rFonts w:asciiTheme="minorHAnsi" w:cstheme="minorBidi" w:eastAsiaTheme="minorHAnsi" w:hAnsiTheme="minorHAnsi"/>
+        <w:rFonts w:asciiTheme="minorHAnsi" w:cstheme="minorBidi" w:eastAsiaTheme="minorEastAsia" w:hAnsiTheme="minorHAnsi"/>
         <w:sz w:val="24"/>
         <w:szCs w:val="24"/>
-        <w:lang w:bidi="ar-SA" w:eastAsia="en-US" w:val="en-US"/>
+        <w:lang w:bidi="ar-SA" w:eastAsia="zh-CN" w:val="en-US"/>
       </w:rPr>
     </w:rPrDefault>
     <w:pPrDefault>
@@ -5121,8 +6194,6 @@
     </w:pPr>
     <w:rPr>
       <w:rFonts w:asciiTheme="majorHAnsi" w:cstheme="majorBidi" w:eastAsiaTheme="majorEastAsia" w:hAnsiTheme="majorHAnsi"/>
-      <w:spacing w:val="-10"/>
-      <w:kern w:val="28"/>
       <w:sz w:val="56"/>
       <w:szCs w:val="56"/>
     </w:rPr>
@@ -5135,8 +6206,6 @@
     <w:rsid w:val="00A10FD9"/>
     <w:rPr>
       <w:rFonts w:asciiTheme="majorHAnsi" w:cstheme="majorBidi" w:eastAsiaTheme="majorEastAsia" w:hAnsiTheme="majorHAnsi"/>
-      <w:spacing w:val="-10"/>
-      <w:kern w:val="28"/>
       <w:sz w:val="56"/>
       <w:szCs w:val="56"/>
     </w:rPr>
@@ -5177,23 +6246,31 @@
   </w:style>
   <w:style w:customStyle="1" w:styleId="Author" w:type="paragraph">
     <w:name w:val="Author"/>
+    <w:basedOn w:val="Title"/>
     <w:next w:val="BodyText"/>
     <w:qFormat/>
     <w:pPr>
       <w:keepNext/>
       <w:keepLines/>
-      <w:jc w:val="center"/>
     </w:pPr>
+    <w:rPr>
+      <w:sz w:val="24"/>
+      <w:szCs w:val="24"/>
+    </w:rPr>
   </w:style>
   <w:style w:styleId="Date" w:type="paragraph">
     <w:name w:val="Date"/>
+    <w:basedOn w:val="Title"/>
     <w:next w:val="BodyText"/>
     <w:qFormat/>
     <w:pPr>
       <w:keepNext/>
       <w:keepLines/>
-      <w:jc w:val="center"/>
     </w:pPr>
+    <w:rPr>
+      <w:sz w:val="24"/>
+      <w:szCs w:val="24"/>
+    </w:rPr>
   </w:style>
   <w:style w:customStyle="1" w:styleId="AbstractTitle" w:type="paragraph">
     <w:name w:val="Abstract Title"/>
@@ -5606,13 +6683,6 @@
       </w:tblCellMar>
     </w:tblPr>
     <w:tblStylePr w:type="firstRow">
-      <w:tblPr>
-        <w:jc w:val="left"/>
-        <w:tblInd w:type="dxa" w:w="0"/>
-      </w:tblPr>
-      <w:trPr>
-        <w:jc w:val="left"/>
-      </w:trPr>
       <w:tcPr>
         <w:tcBorders>
           <w:bottom w:val="single"/>

</xml_diff>